<commit_message>
DAP QB Week 8
</commit_message>
<xml_diff>
--- a/DAP - Data Analysis using Python/DAP_QB_ANS/DAP_QB_Week_8_Ans.docx
+++ b/DAP - Data Analysis using Python/DAP_QB_ANS/DAP_QB_Week_8_Ans.docx
@@ -14,7 +14,7 @@
         <w:jc w:val="center"/>
         <w:outlineLvl w:val="0"/>
         <w:rPr>
-          <w:rFonts w:ascii="Aptos Display" w:eastAsia="Times New Roman" w:hAnsi="Aptos Display" w:cs="Times New Roman"/>
+          <w:rFonts w:asciiTheme="minorHAnsi" w:eastAsia="Times New Roman" w:hAnsiTheme="minorHAnsi" w:cstheme="minorHAnsi"/>
           <w:b/>
           <w:bCs/>
           <w:color w:val="0F4761"/>
@@ -26,7 +26,7 @@
       </w:pPr>
       <w:r>
         <w:rPr>
-          <w:rFonts w:ascii="Aptos Display" w:eastAsia="Times New Roman" w:hAnsi="Aptos Display" w:cs="Times New Roman"/>
+          <w:rFonts w:asciiTheme="minorHAnsi" w:eastAsia="Times New Roman" w:hAnsiTheme="minorHAnsi" w:cstheme="minorHAnsi"/>
           <w:b/>
           <w:bCs/>
           <w:color w:val="0F4761"/>
@@ -40,7 +40,7 @@
       </w:r>
       <w:r>
         <w:rPr>
-          <w:rFonts w:ascii="Aptos Display" w:eastAsia="Times New Roman" w:hAnsi="Aptos Display" w:cs="Times New Roman"/>
+          <w:rFonts w:asciiTheme="minorHAnsi" w:eastAsia="Times New Roman" w:hAnsiTheme="minorHAnsi" w:cstheme="minorHAnsi"/>
           <w:b/>
           <w:bCs/>
           <w:color w:val="0F4761"/>
@@ -65,7 +65,7 @@
         <w:jc w:val="center"/>
         <w:outlineLvl w:val="0"/>
         <w:rPr>
-          <w:rFonts w:ascii="Aptos Display" w:eastAsia="Times New Roman" w:hAnsi="Aptos Display" w:cs="Times New Roman"/>
+          <w:rFonts w:asciiTheme="minorHAnsi" w:eastAsia="Times New Roman" w:hAnsiTheme="minorHAnsi" w:cstheme="minorHAnsi"/>
           <w:color w:val="0F4761"/>
           <w:kern w:val="2"/>
           <w:sz w:val="40"/>
@@ -75,7 +75,7 @@
       </w:pPr>
       <w:r>
         <w:rPr>
-          <w:rFonts w:ascii="Aptos" w:eastAsia="Aptos" w:hAnsi="Aptos" w:cs="Times New Roman"/>
+          <w:rFonts w:asciiTheme="minorHAnsi" w:eastAsia="Aptos" w:hAnsiTheme="minorHAnsi" w:cstheme="minorHAnsi"/>
           <w:b/>
           <w:w w:val="120"/>
           <w:kern w:val="2"/>
@@ -83,11 +83,35 @@
           <w:szCs w:val="36"/>
           <w14:ligatures w14:val="standardContextual"/>
         </w:rPr>
-        <w:t xml:space="preserve">Week 1 </w:t>
+        <w:t xml:space="preserve">Week </w:t>
       </w:r>
       <w:r>
         <w:rPr>
-          <w:rFonts w:ascii="Aptos" w:eastAsia="Aptos" w:hAnsi="Aptos" w:cs="Times New Roman"/>
+          <w:rFonts w:asciiTheme="minorHAnsi" w:eastAsia="Aptos" w:hAnsiTheme="minorHAnsi" w:cstheme="minorHAnsi"/>
+          <w:b/>
+          <w:w w:val="120"/>
+          <w:kern w:val="2"/>
+          <w:sz w:val="32"/>
+          <w:szCs w:val="36"/>
+          <w14:ligatures w14:val="standardContextual"/>
+        </w:rPr>
+        <w:t>8</w:t>
+      </w:r>
+      <w:r>
+        <w:rPr>
+          <w:rFonts w:asciiTheme="minorHAnsi" w:eastAsia="Aptos" w:hAnsiTheme="minorHAnsi" w:cstheme="minorHAnsi"/>
+          <w:b/>
+          <w:w w:val="120"/>
+          <w:kern w:val="2"/>
+          <w:sz w:val="32"/>
+          <w:szCs w:val="36"/>
+          <w14:ligatures w14:val="standardContextual"/>
+        </w:rPr>
+        <w:t xml:space="preserve"> </w:t>
+      </w:r>
+      <w:r>
+        <w:rPr>
+          <w:rFonts w:asciiTheme="minorHAnsi" w:eastAsia="Aptos" w:hAnsiTheme="minorHAnsi" w:cstheme="minorHAnsi"/>
           <w:b/>
           <w:w w:val="120"/>
           <w:kern w:val="2"/>
@@ -99,7 +123,7 @@
       </w:r>
       <w:r>
         <w:rPr>
-          <w:rFonts w:ascii="Aptos" w:eastAsia="Aptos" w:hAnsi="Aptos" w:cs="Times New Roman"/>
+          <w:rFonts w:asciiTheme="minorHAnsi" w:eastAsia="Aptos" w:hAnsiTheme="minorHAnsi" w:cstheme="minorHAnsi"/>
           <w:b/>
           <w:spacing w:val="11"/>
           <w:w w:val="120"/>
@@ -112,7 +136,7 @@
       </w:r>
       <w:r>
         <w:rPr>
-          <w:rFonts w:ascii="Aptos" w:eastAsia="Aptos" w:hAnsi="Aptos" w:cs="Times New Roman"/>
+          <w:rFonts w:asciiTheme="minorHAnsi" w:eastAsia="Aptos" w:hAnsiTheme="minorHAnsi" w:cstheme="minorHAnsi"/>
           <w:b/>
           <w:w w:val="120"/>
           <w:kern w:val="2"/>
@@ -124,7 +148,7 @@
       </w:r>
       <w:r>
         <w:rPr>
-          <w:rFonts w:ascii="Aptos" w:eastAsia="Aptos" w:hAnsi="Aptos" w:cs="Times New Roman"/>
+          <w:rFonts w:asciiTheme="minorHAnsi" w:eastAsia="Aptos" w:hAnsiTheme="minorHAnsi" w:cstheme="minorHAnsi"/>
           <w:b/>
           <w:w w:val="120"/>
           <w:kern w:val="2"/>
@@ -201,6 +225,26 @@
                 <w:szCs w:val="28"/>
               </w:rPr>
             </w:pPr>
+            <w:r>
+              <w:rPr>
+                <w:rFonts w:asciiTheme="minorHAnsi" w:hAnsiTheme="minorHAnsi" w:cstheme="minorHAnsi"/>
+                <w:b/>
+                <w:bCs/>
+                <w:sz w:val="28"/>
+                <w:szCs w:val="28"/>
+              </w:rPr>
+              <w:t>Explain Maximum Likelihood Estimation(MLE)</w:t>
+            </w:r>
+            <w:r>
+              <w:rPr>
+                <w:rFonts w:asciiTheme="minorHAnsi" w:hAnsiTheme="minorHAnsi" w:cstheme="minorHAnsi"/>
+                <w:b/>
+                <w:bCs/>
+                <w:sz w:val="28"/>
+                <w:szCs w:val="28"/>
+              </w:rPr>
+              <w:t>.</w:t>
+            </w:r>
           </w:p>
         </w:tc>
       </w:tr>
@@ -341,6 +385,26 @@
                 <w:szCs w:val="28"/>
               </w:rPr>
             </w:pPr>
+            <w:r>
+              <w:rPr>
+                <w:rFonts w:asciiTheme="minorHAnsi" w:hAnsiTheme="minorHAnsi" w:cstheme="minorHAnsi"/>
+                <w:b/>
+                <w:bCs/>
+                <w:sz w:val="28"/>
+                <w:szCs w:val="28"/>
+              </w:rPr>
+              <w:t>What do you mean by logistic regression and explain when it is used</w:t>
+            </w:r>
+            <w:r>
+              <w:rPr>
+                <w:rFonts w:asciiTheme="minorHAnsi" w:hAnsiTheme="minorHAnsi" w:cstheme="minorHAnsi"/>
+                <w:b/>
+                <w:bCs/>
+                <w:sz w:val="28"/>
+                <w:szCs w:val="28"/>
+              </w:rPr>
+              <w:t>?</w:t>
+            </w:r>
           </w:p>
         </w:tc>
       </w:tr>
@@ -480,6 +544,16 @@
                 <w:szCs w:val="28"/>
               </w:rPr>
             </w:pPr>
+            <w:r>
+              <w:rPr>
+                <w:rFonts w:asciiTheme="minorHAnsi" w:hAnsiTheme="minorHAnsi" w:cstheme="minorHAnsi"/>
+                <w:b/>
+                <w:bCs/>
+                <w:sz w:val="28"/>
+                <w:szCs w:val="28"/>
+              </w:rPr>
+              <w:t>What is G test statistic used in logistic regression?</w:t>
+            </w:r>
           </w:p>
         </w:tc>
       </w:tr>
@@ -513,29 +587,7 @@
                 <w:sz w:val="28"/>
                 <w:szCs w:val="28"/>
               </w:rPr>
-              <w:t>Ans.</w:t>
-            </w:r>
-            <w:r>
-              <w:rPr>
-                <w:rFonts w:asciiTheme="minorHAnsi" w:hAnsiTheme="minorHAnsi" w:cstheme="minorHAnsi"/>
-                <w:b/>
-                <w:bCs/>
-                <w:color w:val="FF0000"/>
-                <w:sz w:val="28"/>
-                <w:szCs w:val="28"/>
-              </w:rPr>
-              <w:t>3</w:t>
-            </w:r>
-            <w:r>
-              <w:rPr>
-                <w:rFonts w:asciiTheme="minorHAnsi" w:hAnsiTheme="minorHAnsi" w:cstheme="minorHAnsi"/>
-                <w:b/>
-                <w:bCs/>
-                <w:color w:val="FF0000"/>
-                <w:sz w:val="28"/>
-                <w:szCs w:val="28"/>
-              </w:rPr>
-              <w:t>)</w:t>
+              <w:t>Ans.3)</w:t>
             </w:r>
           </w:p>
         </w:tc>
@@ -640,6 +692,26 @@
                 <w:szCs w:val="28"/>
               </w:rPr>
             </w:pPr>
+            <w:r>
+              <w:rPr>
+                <w:rFonts w:asciiTheme="minorHAnsi" w:hAnsiTheme="minorHAnsi" w:cstheme="minorHAnsi"/>
+                <w:b/>
+                <w:bCs/>
+                <w:sz w:val="28"/>
+                <w:szCs w:val="28"/>
+              </w:rPr>
+              <w:t>Compare Linear Regression model and Logistic regression model</w:t>
+            </w:r>
+            <w:r>
+              <w:rPr>
+                <w:rFonts w:asciiTheme="minorHAnsi" w:hAnsiTheme="minorHAnsi" w:cstheme="minorHAnsi"/>
+                <w:b/>
+                <w:bCs/>
+                <w:sz w:val="28"/>
+                <w:szCs w:val="28"/>
+              </w:rPr>
+              <w:t>.</w:t>
+            </w:r>
           </w:p>
         </w:tc>
       </w:tr>
@@ -673,29 +745,7 @@
                 <w:sz w:val="28"/>
                 <w:szCs w:val="28"/>
               </w:rPr>
-              <w:t>Ans.</w:t>
-            </w:r>
-            <w:r>
-              <w:rPr>
-                <w:rFonts w:asciiTheme="minorHAnsi" w:hAnsiTheme="minorHAnsi" w:cstheme="minorHAnsi"/>
-                <w:b/>
-                <w:bCs/>
-                <w:color w:val="FF0000"/>
-                <w:sz w:val="28"/>
-                <w:szCs w:val="28"/>
-              </w:rPr>
-              <w:t>4</w:t>
-            </w:r>
-            <w:r>
-              <w:rPr>
-                <w:rFonts w:asciiTheme="minorHAnsi" w:hAnsiTheme="minorHAnsi" w:cstheme="minorHAnsi"/>
-                <w:b/>
-                <w:bCs/>
-                <w:color w:val="FF0000"/>
-                <w:sz w:val="28"/>
-                <w:szCs w:val="28"/>
-              </w:rPr>
-              <w:t>)</w:t>
+              <w:t>Ans.4)</w:t>
             </w:r>
           </w:p>
         </w:tc>
@@ -803,6 +853,16 @@
                 <w:szCs w:val="28"/>
               </w:rPr>
             </w:pPr>
+            <w:r>
+              <w:rPr>
+                <w:rFonts w:asciiTheme="minorHAnsi" w:hAnsiTheme="minorHAnsi" w:cstheme="minorHAnsi"/>
+                <w:b/>
+                <w:bCs/>
+                <w:sz w:val="28"/>
+                <w:szCs w:val="28"/>
+              </w:rPr>
+              <w:t>Give the Objectives of logistic regression.</w:t>
+            </w:r>
           </w:p>
         </w:tc>
       </w:tr>
@@ -837,29 +897,7 @@
                 <w:sz w:val="28"/>
                 <w:szCs w:val="28"/>
               </w:rPr>
-              <w:t>Ans.</w:t>
-            </w:r>
-            <w:r>
-              <w:rPr>
-                <w:rFonts w:asciiTheme="minorHAnsi" w:hAnsiTheme="minorHAnsi" w:cstheme="minorHAnsi"/>
-                <w:b/>
-                <w:bCs/>
-                <w:color w:val="FF0000"/>
-                <w:sz w:val="28"/>
-                <w:szCs w:val="28"/>
-              </w:rPr>
-              <w:t>5</w:t>
-            </w:r>
-            <w:r>
-              <w:rPr>
-                <w:rFonts w:asciiTheme="minorHAnsi" w:hAnsiTheme="minorHAnsi" w:cstheme="minorHAnsi"/>
-                <w:b/>
-                <w:bCs/>
-                <w:color w:val="FF0000"/>
-                <w:sz w:val="28"/>
-                <w:szCs w:val="28"/>
-              </w:rPr>
-              <w:t>)</w:t>
+              <w:t>Ans.5)</w:t>
             </w:r>
           </w:p>
         </w:tc>
@@ -965,6 +1003,16 @@
                 <w:szCs w:val="28"/>
               </w:rPr>
             </w:pPr>
+            <w:r>
+              <w:rPr>
+                <w:rFonts w:asciiTheme="minorHAnsi" w:hAnsiTheme="minorHAnsi" w:cstheme="minorHAnsi"/>
+                <w:b/>
+                <w:bCs/>
+                <w:sz w:val="28"/>
+                <w:szCs w:val="28"/>
+              </w:rPr>
+              <w:t>What is Log likelihood?</w:t>
+            </w:r>
           </w:p>
         </w:tc>
       </w:tr>
@@ -998,29 +1046,7 @@
                 <w:sz w:val="28"/>
                 <w:szCs w:val="28"/>
               </w:rPr>
-              <w:t>Ans.</w:t>
-            </w:r>
-            <w:r>
-              <w:rPr>
-                <w:rFonts w:asciiTheme="minorHAnsi" w:hAnsiTheme="minorHAnsi" w:cstheme="minorHAnsi"/>
-                <w:b/>
-                <w:bCs/>
-                <w:color w:val="FF0000"/>
-                <w:sz w:val="28"/>
-                <w:szCs w:val="28"/>
-              </w:rPr>
-              <w:t>6</w:t>
-            </w:r>
-            <w:r>
-              <w:rPr>
-                <w:rFonts w:asciiTheme="minorHAnsi" w:hAnsiTheme="minorHAnsi" w:cstheme="minorHAnsi"/>
-                <w:b/>
-                <w:bCs/>
-                <w:color w:val="FF0000"/>
-                <w:sz w:val="28"/>
-                <w:szCs w:val="28"/>
-              </w:rPr>
-              <w:t>)</w:t>
+              <w:t>Ans.6)</w:t>
             </w:r>
           </w:p>
         </w:tc>
@@ -1128,6 +1154,16 @@
                 <w:szCs w:val="28"/>
               </w:rPr>
             </w:pPr>
+            <w:r>
+              <w:rPr>
+                <w:rFonts w:asciiTheme="minorHAnsi" w:hAnsiTheme="minorHAnsi" w:cstheme="minorHAnsi"/>
+                <w:b/>
+                <w:bCs/>
+                <w:sz w:val="28"/>
+                <w:szCs w:val="28"/>
+              </w:rPr>
+              <w:t>Differentiate between Logistic regression and discriminant analysis.</w:t>
+            </w:r>
           </w:p>
         </w:tc>
       </w:tr>
@@ -1162,29 +1198,7 @@
                 <w:sz w:val="28"/>
                 <w:szCs w:val="28"/>
               </w:rPr>
-              <w:t>Ans.</w:t>
-            </w:r>
-            <w:r>
-              <w:rPr>
-                <w:rFonts w:asciiTheme="minorHAnsi" w:hAnsiTheme="minorHAnsi" w:cstheme="minorHAnsi"/>
-                <w:b/>
-                <w:bCs/>
-                <w:color w:val="FF0000"/>
-                <w:sz w:val="28"/>
-                <w:szCs w:val="28"/>
-              </w:rPr>
-              <w:t>7</w:t>
-            </w:r>
-            <w:r>
-              <w:rPr>
-                <w:rFonts w:asciiTheme="minorHAnsi" w:hAnsiTheme="minorHAnsi" w:cstheme="minorHAnsi"/>
-                <w:b/>
-                <w:bCs/>
-                <w:color w:val="FF0000"/>
-                <w:sz w:val="28"/>
-                <w:szCs w:val="28"/>
-              </w:rPr>
-              <w:t>)</w:t>
+              <w:t>Ans.7)</w:t>
             </w:r>
           </w:p>
         </w:tc>
@@ -1290,6 +1304,16 @@
                 <w:szCs w:val="28"/>
               </w:rPr>
             </w:pPr>
+            <w:r>
+              <w:rPr>
+                <w:rFonts w:asciiTheme="minorHAnsi" w:hAnsiTheme="minorHAnsi" w:cstheme="minorHAnsi"/>
+                <w:b/>
+                <w:bCs/>
+                <w:sz w:val="28"/>
+                <w:szCs w:val="28"/>
+              </w:rPr>
+              <w:t>Explain the Normality of Residual (Error) in both linear and logistic regression.</w:t>
+            </w:r>
           </w:p>
         </w:tc>
       </w:tr>
@@ -1323,29 +1347,7 @@
                 <w:sz w:val="28"/>
                 <w:szCs w:val="28"/>
               </w:rPr>
-              <w:t>Ans.</w:t>
-            </w:r>
-            <w:r>
-              <w:rPr>
-                <w:rFonts w:asciiTheme="minorHAnsi" w:hAnsiTheme="minorHAnsi" w:cstheme="minorHAnsi"/>
-                <w:b/>
-                <w:bCs/>
-                <w:color w:val="FF0000"/>
-                <w:sz w:val="28"/>
-                <w:szCs w:val="28"/>
-              </w:rPr>
-              <w:t>8</w:t>
-            </w:r>
-            <w:r>
-              <w:rPr>
-                <w:rFonts w:asciiTheme="minorHAnsi" w:hAnsiTheme="minorHAnsi" w:cstheme="minorHAnsi"/>
-                <w:b/>
-                <w:bCs/>
-                <w:color w:val="FF0000"/>
-                <w:sz w:val="28"/>
-                <w:szCs w:val="28"/>
-              </w:rPr>
-              <w:t>)</w:t>
+              <w:t>Ans.8)</w:t>
             </w:r>
           </w:p>
         </w:tc>
@@ -1417,6 +1419,7 @@
                 <w:rFonts w:asciiTheme="minorHAnsi" w:hAnsiTheme="minorHAnsi" w:cstheme="minorHAnsi"/>
                 <w:b/>
                 <w:bCs/>
+                <w:color w:val="FF0000"/>
                 <w:sz w:val="28"/>
                 <w:szCs w:val="28"/>
               </w:rPr>
@@ -1450,6 +1453,16 @@
                 <w:szCs w:val="28"/>
               </w:rPr>
             </w:pPr>
+            <w:r>
+              <w:rPr>
+                <w:rFonts w:asciiTheme="minorHAnsi" w:hAnsiTheme="minorHAnsi" w:cstheme="minorHAnsi"/>
+                <w:b/>
+                <w:bCs/>
+                <w:sz w:val="28"/>
+                <w:szCs w:val="28"/>
+              </w:rPr>
+              <w:t>The logit function(given as l(x)) is the log of odds function. What could be the range of logit function in the domain x = [0,1]?</w:t>
+            </w:r>
           </w:p>
         </w:tc>
       </w:tr>
@@ -1470,6 +1483,7 @@
                 <w:rFonts w:asciiTheme="minorHAnsi" w:hAnsiTheme="minorHAnsi" w:cstheme="minorHAnsi"/>
                 <w:b/>
                 <w:bCs/>
+                <w:color w:val="FF0000"/>
                 <w:sz w:val="28"/>
                 <w:szCs w:val="28"/>
               </w:rPr>
@@ -1483,29 +1497,7 @@
                 <w:sz w:val="28"/>
                 <w:szCs w:val="28"/>
               </w:rPr>
-              <w:t>Ans.</w:t>
-            </w:r>
-            <w:r>
-              <w:rPr>
-                <w:rFonts w:asciiTheme="minorHAnsi" w:hAnsiTheme="minorHAnsi" w:cstheme="minorHAnsi"/>
-                <w:b/>
-                <w:bCs/>
-                <w:color w:val="FF0000"/>
-                <w:sz w:val="28"/>
-                <w:szCs w:val="28"/>
-              </w:rPr>
-              <w:t>9</w:t>
-            </w:r>
-            <w:r>
-              <w:rPr>
-                <w:rFonts w:asciiTheme="minorHAnsi" w:hAnsiTheme="minorHAnsi" w:cstheme="minorHAnsi"/>
-                <w:b/>
-                <w:bCs/>
-                <w:color w:val="FF0000"/>
-                <w:sz w:val="28"/>
-                <w:szCs w:val="28"/>
-              </w:rPr>
-              <w:t>)</w:t>
+              <w:t>Ans.9)</w:t>
             </w:r>
           </w:p>
         </w:tc>
@@ -1528,1429 +1520,11 @@
     </w:tbl>
     <w:p>
       <w:pPr>
-        <w:pStyle w:val="TableParagraph"/>
-        <w:ind w:left="1"/>
-        <w:jc w:val="center"/>
         <w:rPr>
           <w:rFonts w:asciiTheme="minorHAnsi" w:hAnsiTheme="minorHAnsi" w:cstheme="minorHAnsi"/>
-          <w:b/>
-          <w:bCs/>
-          <w:sz w:val="28"/>
-          <w:szCs w:val="28"/>
         </w:rPr>
-        <w:sectPr>
-          <w:pgSz w:w="11913" w:h="13041"/>
-          <w:pgMar w:top="142" w:right="573" w:bottom="278" w:left="697" w:header="720" w:footer="720" w:gutter="0"/>
-          <w:cols w:space="720"/>
-        </w:sectPr>
       </w:pPr>
     </w:p>
-    <w:tbl>
-      <w:tblPr>
-        <w:tblW w:w="11340" w:type="dxa"/>
-        <w:tblInd w:w="-562" w:type="dxa"/>
-        <w:tblLayout w:type="fixed"/>
-        <w:tblCellMar>
-          <w:left w:w="0" w:type="dxa"/>
-          <w:right w:w="0" w:type="dxa"/>
-        </w:tblCellMar>
-        <w:tblLook w:val="01E0" w:firstRow="1" w:lastRow="1" w:firstColumn="1" w:lastColumn="1" w:noHBand="0" w:noVBand="0"/>
-      </w:tblPr>
-      <w:tblGrid>
-        <w:gridCol w:w="993"/>
-        <w:gridCol w:w="10347"/>
-      </w:tblGrid>
-      <w:tr>
-        <w:trPr>
-          <w:trHeight w:val="20"/>
-        </w:trPr>
-        <w:tc>
-          <w:tcPr>
-            <w:tcW w:w="993" w:type="dxa"/>
-          </w:tcPr>
-          <w:p>
-            <w:pPr>
-              <w:pStyle w:val="TableParagraph"/>
-              <w:ind w:left="1"/>
-              <w:jc w:val="center"/>
-              <w:rPr>
-                <w:rFonts w:asciiTheme="minorHAnsi" w:hAnsiTheme="minorHAnsi" w:cstheme="minorHAnsi"/>
-                <w:b/>
-                <w:bCs/>
-                <w:sz w:val="28"/>
-                <w:szCs w:val="28"/>
-              </w:rPr>
-            </w:pPr>
-            <w:r>
-              <w:rPr>
-                <w:rFonts w:asciiTheme="minorHAnsi" w:hAnsiTheme="minorHAnsi" w:cstheme="minorHAnsi"/>
-                <w:b/>
-                <w:bCs/>
-                <w:sz w:val="28"/>
-                <w:szCs w:val="28"/>
-              </w:rPr>
-              <w:lastRenderedPageBreak/>
-              <w:t>10</w:t>
-            </w:r>
-          </w:p>
-        </w:tc>
-        <w:tc>
-          <w:tcPr>
-            <w:tcW w:w="10347" w:type="dxa"/>
-          </w:tcPr>
-          <w:p>
-            <w:pPr>
-              <w:pStyle w:val="TableParagraph"/>
-              <w:ind w:left="0"/>
-              <w:rPr>
-                <w:rFonts w:asciiTheme="minorHAnsi" w:hAnsiTheme="minorHAnsi" w:cstheme="minorHAnsi"/>
-                <w:b/>
-                <w:bCs/>
-                <w:sz w:val="28"/>
-                <w:szCs w:val="28"/>
-              </w:rPr>
-            </w:pPr>
-          </w:p>
-        </w:tc>
-      </w:tr>
-      <w:tr>
-        <w:trPr>
-          <w:trHeight w:val="20"/>
-        </w:trPr>
-        <w:tc>
-          <w:tcPr>
-            <w:tcW w:w="993" w:type="dxa"/>
-          </w:tcPr>
-          <w:p>
-            <w:pPr>
-              <w:pStyle w:val="TableParagraph"/>
-              <w:ind w:left="1"/>
-              <w:jc w:val="center"/>
-              <w:rPr>
-                <w:rFonts w:asciiTheme="minorHAnsi" w:hAnsiTheme="minorHAnsi" w:cstheme="minorHAnsi"/>
-                <w:b/>
-                <w:bCs/>
-                <w:sz w:val="28"/>
-                <w:szCs w:val="28"/>
-              </w:rPr>
-            </w:pPr>
-            <w:r>
-              <w:rPr>
-                <w:rFonts w:asciiTheme="minorHAnsi" w:hAnsiTheme="minorHAnsi" w:cstheme="minorHAnsi"/>
-                <w:b/>
-                <w:bCs/>
-                <w:color w:val="FF0000"/>
-                <w:sz w:val="28"/>
-                <w:szCs w:val="28"/>
-              </w:rPr>
-              <w:t>Ans.</w:t>
-            </w:r>
-            <w:r>
-              <w:rPr>
-                <w:rFonts w:asciiTheme="minorHAnsi" w:hAnsiTheme="minorHAnsi" w:cstheme="minorHAnsi"/>
-                <w:b/>
-                <w:bCs/>
-                <w:color w:val="FF0000"/>
-                <w:sz w:val="28"/>
-                <w:szCs w:val="28"/>
-              </w:rPr>
-              <w:t>10</w:t>
-            </w:r>
-            <w:r>
-              <w:rPr>
-                <w:rFonts w:asciiTheme="minorHAnsi" w:hAnsiTheme="minorHAnsi" w:cstheme="minorHAnsi"/>
-                <w:b/>
-                <w:bCs/>
-                <w:color w:val="FF0000"/>
-                <w:sz w:val="28"/>
-                <w:szCs w:val="28"/>
-              </w:rPr>
-              <w:t>)</w:t>
-            </w:r>
-          </w:p>
-        </w:tc>
-        <w:tc>
-          <w:tcPr>
-            <w:tcW w:w="10347" w:type="dxa"/>
-          </w:tcPr>
-          <w:p>
-            <w:pPr>
-              <w:pStyle w:val="TableParagraph"/>
-              <w:rPr>
-                <w:rFonts w:asciiTheme="minorHAnsi" w:hAnsiTheme="minorHAnsi" w:cstheme="minorHAnsi"/>
-                <w:sz w:val="28"/>
-                <w:szCs w:val="28"/>
-              </w:rPr>
-            </w:pPr>
-          </w:p>
-        </w:tc>
-      </w:tr>
-    </w:tbl>
-    <w:p>
-      <w:pPr>
-        <w:pStyle w:val="TableParagraph"/>
-        <w:ind w:left="1"/>
-        <w:jc w:val="center"/>
-        <w:rPr>
-          <w:rFonts w:asciiTheme="minorHAnsi" w:hAnsiTheme="minorHAnsi" w:cstheme="minorHAnsi"/>
-          <w:b/>
-          <w:bCs/>
-          <w:sz w:val="28"/>
-          <w:szCs w:val="28"/>
-        </w:rPr>
-        <w:sectPr>
-          <w:pgSz w:w="11913" w:h="14175"/>
-          <w:pgMar w:top="142" w:right="573" w:bottom="278" w:left="697" w:header="720" w:footer="720" w:gutter="0"/>
-          <w:cols w:space="720"/>
-        </w:sectPr>
-      </w:pPr>
-    </w:p>
-    <w:tbl>
-      <w:tblPr>
-        <w:tblW w:w="11340" w:type="dxa"/>
-        <w:tblInd w:w="-562" w:type="dxa"/>
-        <w:tblLayout w:type="fixed"/>
-        <w:tblCellMar>
-          <w:left w:w="0" w:type="dxa"/>
-          <w:right w:w="0" w:type="dxa"/>
-        </w:tblCellMar>
-        <w:tblLook w:val="01E0" w:firstRow="1" w:lastRow="1" w:firstColumn="1" w:lastColumn="1" w:noHBand="0" w:noVBand="0"/>
-      </w:tblPr>
-      <w:tblGrid>
-        <w:gridCol w:w="993"/>
-        <w:gridCol w:w="10347"/>
-      </w:tblGrid>
-      <w:tr>
-        <w:trPr>
-          <w:trHeight w:val="20"/>
-        </w:trPr>
-        <w:tc>
-          <w:tcPr>
-            <w:tcW w:w="993" w:type="dxa"/>
-          </w:tcPr>
-          <w:p>
-            <w:pPr>
-              <w:pStyle w:val="TableParagraph"/>
-              <w:ind w:left="1"/>
-              <w:jc w:val="center"/>
-              <w:rPr>
-                <w:rFonts w:asciiTheme="minorHAnsi" w:hAnsiTheme="minorHAnsi" w:cstheme="minorHAnsi"/>
-                <w:b/>
-                <w:bCs/>
-                <w:sz w:val="28"/>
-                <w:szCs w:val="28"/>
-              </w:rPr>
-            </w:pPr>
-            <w:r>
-              <w:rPr>
-                <w:rFonts w:asciiTheme="minorHAnsi" w:hAnsiTheme="minorHAnsi" w:cstheme="minorHAnsi"/>
-                <w:b/>
-                <w:bCs/>
-                <w:sz w:val="28"/>
-                <w:szCs w:val="28"/>
-              </w:rPr>
-              <w:lastRenderedPageBreak/>
-              <w:t>11</w:t>
-            </w:r>
-          </w:p>
-        </w:tc>
-        <w:tc>
-          <w:tcPr>
-            <w:tcW w:w="10347" w:type="dxa"/>
-          </w:tcPr>
-          <w:p>
-            <w:pPr>
-              <w:pStyle w:val="TableParagraph"/>
-              <w:ind w:left="0"/>
-              <w:rPr>
-                <w:rFonts w:asciiTheme="minorHAnsi" w:hAnsiTheme="minorHAnsi" w:cstheme="minorHAnsi"/>
-                <w:b/>
-                <w:bCs/>
-                <w:sz w:val="28"/>
-                <w:szCs w:val="28"/>
-              </w:rPr>
-            </w:pPr>
-          </w:p>
-        </w:tc>
-      </w:tr>
-      <w:tr>
-        <w:trPr>
-          <w:trHeight w:val="20"/>
-        </w:trPr>
-        <w:tc>
-          <w:tcPr>
-            <w:tcW w:w="993" w:type="dxa"/>
-          </w:tcPr>
-          <w:p>
-            <w:pPr>
-              <w:pStyle w:val="TableParagraph"/>
-              <w:ind w:left="1"/>
-              <w:jc w:val="center"/>
-              <w:rPr>
-                <w:rFonts w:asciiTheme="minorHAnsi" w:hAnsiTheme="minorHAnsi" w:cstheme="minorHAnsi"/>
-                <w:b/>
-                <w:bCs/>
-                <w:sz w:val="28"/>
-                <w:szCs w:val="28"/>
-              </w:rPr>
-            </w:pPr>
-            <w:r>
-              <w:rPr>
-                <w:rFonts w:asciiTheme="minorHAnsi" w:hAnsiTheme="minorHAnsi" w:cstheme="minorHAnsi"/>
-                <w:b/>
-                <w:bCs/>
-                <w:color w:val="FF0000"/>
-                <w:sz w:val="28"/>
-                <w:szCs w:val="28"/>
-              </w:rPr>
-              <w:t>Ans.</w:t>
-            </w:r>
-            <w:r>
-              <w:rPr>
-                <w:rFonts w:asciiTheme="minorHAnsi" w:hAnsiTheme="minorHAnsi" w:cstheme="minorHAnsi"/>
-                <w:b/>
-                <w:bCs/>
-                <w:color w:val="FF0000"/>
-                <w:sz w:val="28"/>
-                <w:szCs w:val="28"/>
-              </w:rPr>
-              <w:t>11</w:t>
-            </w:r>
-            <w:r>
-              <w:rPr>
-                <w:rFonts w:asciiTheme="minorHAnsi" w:hAnsiTheme="minorHAnsi" w:cstheme="minorHAnsi"/>
-                <w:b/>
-                <w:bCs/>
-                <w:color w:val="FF0000"/>
-                <w:sz w:val="28"/>
-                <w:szCs w:val="28"/>
-              </w:rPr>
-              <w:t>)</w:t>
-            </w:r>
-          </w:p>
-        </w:tc>
-        <w:tc>
-          <w:tcPr>
-            <w:tcW w:w="10347" w:type="dxa"/>
-          </w:tcPr>
-          <w:p>
-            <w:pPr>
-              <w:pStyle w:val="TableParagraph"/>
-              <w:rPr>
-                <w:rFonts w:asciiTheme="minorHAnsi" w:hAnsiTheme="minorHAnsi" w:cstheme="minorHAnsi"/>
-                <w:sz w:val="28"/>
-                <w:szCs w:val="28"/>
-              </w:rPr>
-            </w:pPr>
-          </w:p>
-        </w:tc>
-      </w:tr>
-    </w:tbl>
-    <w:p>
-      <w:pPr>
-        <w:pStyle w:val="TableParagraph"/>
-        <w:ind w:left="1"/>
-        <w:jc w:val="center"/>
-        <w:rPr>
-          <w:b/>
-          <w:bCs/>
-          <w:sz w:val="28"/>
-          <w:szCs w:val="28"/>
-        </w:rPr>
-        <w:sectPr>
-          <w:pgSz w:w="11913" w:h="10773"/>
-          <w:pgMar w:top="142" w:right="573" w:bottom="278" w:left="697" w:header="720" w:footer="720" w:gutter="0"/>
-          <w:cols w:space="720"/>
-        </w:sectPr>
-      </w:pPr>
-    </w:p>
-    <w:tbl>
-      <w:tblPr>
-        <w:tblW w:w="11340" w:type="dxa"/>
-        <w:tblInd w:w="-562" w:type="dxa"/>
-        <w:tblLayout w:type="fixed"/>
-        <w:tblCellMar>
-          <w:left w:w="0" w:type="dxa"/>
-          <w:right w:w="0" w:type="dxa"/>
-        </w:tblCellMar>
-        <w:tblLook w:val="01E0" w:firstRow="1" w:lastRow="1" w:firstColumn="1" w:lastColumn="1" w:noHBand="0" w:noVBand="0"/>
-      </w:tblPr>
-      <w:tblGrid>
-        <w:gridCol w:w="993"/>
-        <w:gridCol w:w="10347"/>
-      </w:tblGrid>
-      <w:tr>
-        <w:trPr>
-          <w:trHeight w:val="20"/>
-        </w:trPr>
-        <w:tc>
-          <w:tcPr>
-            <w:tcW w:w="993" w:type="dxa"/>
-          </w:tcPr>
-          <w:p>
-            <w:pPr>
-              <w:pStyle w:val="TableParagraph"/>
-              <w:ind w:left="1"/>
-              <w:jc w:val="center"/>
-              <w:rPr>
-                <w:rFonts w:asciiTheme="minorHAnsi" w:hAnsiTheme="minorHAnsi" w:cstheme="minorHAnsi"/>
-                <w:b/>
-                <w:bCs/>
-                <w:color w:val="FF0000"/>
-                <w:sz w:val="28"/>
-                <w:szCs w:val="28"/>
-              </w:rPr>
-            </w:pPr>
-            <w:r>
-              <w:rPr>
-                <w:b/>
-                <w:bCs/>
-                <w:sz w:val="28"/>
-                <w:szCs w:val="28"/>
-              </w:rPr>
-              <w:lastRenderedPageBreak/>
-              <w:t>12</w:t>
-            </w:r>
-          </w:p>
-        </w:tc>
-        <w:tc>
-          <w:tcPr>
-            <w:tcW w:w="10347" w:type="dxa"/>
-          </w:tcPr>
-          <w:p>
-            <w:pPr>
-              <w:pStyle w:val="TableParagraph"/>
-              <w:rPr>
-                <w:rFonts w:asciiTheme="minorHAnsi" w:hAnsiTheme="minorHAnsi" w:cstheme="minorHAnsi"/>
-                <w:sz w:val="28"/>
-                <w:szCs w:val="28"/>
-              </w:rPr>
-            </w:pPr>
-          </w:p>
-        </w:tc>
-      </w:tr>
-      <w:tr>
-        <w:trPr>
-          <w:trHeight w:val="20"/>
-        </w:trPr>
-        <w:tc>
-          <w:tcPr>
-            <w:tcW w:w="993" w:type="dxa"/>
-          </w:tcPr>
-          <w:p>
-            <w:pPr>
-              <w:pStyle w:val="TableParagraph"/>
-              <w:ind w:left="1"/>
-              <w:jc w:val="center"/>
-              <w:rPr>
-                <w:rFonts w:asciiTheme="minorHAnsi" w:hAnsiTheme="minorHAnsi" w:cstheme="minorHAnsi"/>
-                <w:b/>
-                <w:bCs/>
-                <w:color w:val="FF0000"/>
-                <w:sz w:val="28"/>
-                <w:szCs w:val="28"/>
-              </w:rPr>
-            </w:pPr>
-            <w:r>
-              <w:rPr>
-                <w:rFonts w:asciiTheme="minorHAnsi" w:hAnsiTheme="minorHAnsi" w:cstheme="minorHAnsi"/>
-                <w:b/>
-                <w:bCs/>
-                <w:color w:val="FF0000"/>
-                <w:sz w:val="28"/>
-                <w:szCs w:val="28"/>
-              </w:rPr>
-              <w:t>Ans.</w:t>
-            </w:r>
-            <w:r>
-              <w:rPr>
-                <w:rFonts w:asciiTheme="minorHAnsi" w:hAnsiTheme="minorHAnsi" w:cstheme="minorHAnsi"/>
-                <w:b/>
-                <w:bCs/>
-                <w:color w:val="FF0000"/>
-                <w:sz w:val="28"/>
-                <w:szCs w:val="28"/>
-              </w:rPr>
-              <w:t>12</w:t>
-            </w:r>
-            <w:r>
-              <w:rPr>
-                <w:rFonts w:asciiTheme="minorHAnsi" w:hAnsiTheme="minorHAnsi" w:cstheme="minorHAnsi"/>
-                <w:b/>
-                <w:bCs/>
-                <w:color w:val="FF0000"/>
-                <w:sz w:val="28"/>
-                <w:szCs w:val="28"/>
-              </w:rPr>
-              <w:t>)</w:t>
-            </w:r>
-          </w:p>
-        </w:tc>
-        <w:tc>
-          <w:tcPr>
-            <w:tcW w:w="10347" w:type="dxa"/>
-          </w:tcPr>
-          <w:p>
-            <w:pPr>
-              <w:pStyle w:val="TableParagraph"/>
-              <w:rPr>
-                <w:rFonts w:asciiTheme="minorHAnsi" w:hAnsiTheme="minorHAnsi" w:cstheme="minorHAnsi"/>
-                <w:sz w:val="28"/>
-                <w:szCs w:val="28"/>
-              </w:rPr>
-            </w:pPr>
-          </w:p>
-        </w:tc>
-      </w:tr>
-    </w:tbl>
-    <w:p>
-      <w:pPr>
-        <w:pStyle w:val="TableParagraph"/>
-        <w:ind w:left="1"/>
-        <w:jc w:val="center"/>
-        <w:rPr>
-          <w:sz w:val="28"/>
-          <w:szCs w:val="28"/>
-        </w:rPr>
-        <w:sectPr>
-          <w:pgSz w:w="11913" w:h="20412"/>
-          <w:pgMar w:top="142" w:right="573" w:bottom="278" w:left="697" w:header="720" w:footer="720" w:gutter="0"/>
-          <w:cols w:space="720"/>
-        </w:sectPr>
-      </w:pPr>
-    </w:p>
-    <w:tbl>
-      <w:tblPr>
-        <w:tblW w:w="11340" w:type="dxa"/>
-        <w:tblInd w:w="-562" w:type="dxa"/>
-        <w:tblLayout w:type="fixed"/>
-        <w:tblCellMar>
-          <w:left w:w="0" w:type="dxa"/>
-          <w:right w:w="0" w:type="dxa"/>
-        </w:tblCellMar>
-        <w:tblLook w:val="01E0" w:firstRow="1" w:lastRow="1" w:firstColumn="1" w:lastColumn="1" w:noHBand="0" w:noVBand="0"/>
-      </w:tblPr>
-      <w:tblGrid>
-        <w:gridCol w:w="993"/>
-        <w:gridCol w:w="10347"/>
-      </w:tblGrid>
-      <w:tr>
-        <w:trPr>
-          <w:trHeight w:val="20"/>
-        </w:trPr>
-        <w:tc>
-          <w:tcPr>
-            <w:tcW w:w="993" w:type="dxa"/>
-          </w:tcPr>
-          <w:p>
-            <w:pPr>
-              <w:pStyle w:val="TableParagraph"/>
-              <w:ind w:left="1"/>
-              <w:jc w:val="center"/>
-              <w:rPr>
-                <w:rFonts w:asciiTheme="minorHAnsi" w:hAnsiTheme="minorHAnsi" w:cstheme="minorHAnsi"/>
-                <w:b/>
-                <w:bCs/>
-                <w:color w:val="FF0000"/>
-                <w:sz w:val="28"/>
-                <w:szCs w:val="28"/>
-              </w:rPr>
-            </w:pPr>
-            <w:r>
-              <w:rPr>
-                <w:b/>
-                <w:bCs/>
-                <w:sz w:val="28"/>
-                <w:szCs w:val="28"/>
-              </w:rPr>
-              <w:lastRenderedPageBreak/>
-              <w:t>13</w:t>
-            </w:r>
-          </w:p>
-        </w:tc>
-        <w:tc>
-          <w:tcPr>
-            <w:tcW w:w="10347" w:type="dxa"/>
-          </w:tcPr>
-          <w:p>
-            <w:pPr>
-              <w:pStyle w:val="TableParagraph"/>
-              <w:rPr>
-                <w:rFonts w:asciiTheme="minorHAnsi" w:hAnsiTheme="minorHAnsi" w:cstheme="minorHAnsi"/>
-                <w:b/>
-                <w:bCs/>
-                <w:sz w:val="28"/>
-                <w:szCs w:val="28"/>
-              </w:rPr>
-            </w:pPr>
-          </w:p>
-        </w:tc>
-      </w:tr>
-      <w:tr>
-        <w:trPr>
-          <w:trHeight w:val="20"/>
-        </w:trPr>
-        <w:tc>
-          <w:tcPr>
-            <w:tcW w:w="993" w:type="dxa"/>
-          </w:tcPr>
-          <w:p>
-            <w:pPr>
-              <w:pStyle w:val="TableParagraph"/>
-              <w:ind w:left="1"/>
-              <w:jc w:val="center"/>
-              <w:rPr>
-                <w:rFonts w:asciiTheme="minorHAnsi" w:hAnsiTheme="minorHAnsi" w:cstheme="minorHAnsi"/>
-                <w:b/>
-                <w:bCs/>
-                <w:color w:val="FF0000"/>
-                <w:sz w:val="28"/>
-                <w:szCs w:val="28"/>
-              </w:rPr>
-            </w:pPr>
-            <w:r>
-              <w:rPr>
-                <w:rFonts w:asciiTheme="minorHAnsi" w:hAnsiTheme="minorHAnsi" w:cstheme="minorHAnsi"/>
-                <w:b/>
-                <w:bCs/>
-                <w:color w:val="FF0000"/>
-                <w:sz w:val="28"/>
-                <w:szCs w:val="28"/>
-              </w:rPr>
-              <w:t>Ans.13)</w:t>
-            </w:r>
-          </w:p>
-        </w:tc>
-        <w:tc>
-          <w:tcPr>
-            <w:tcW w:w="10347" w:type="dxa"/>
-          </w:tcPr>
-          <w:p>
-            <w:pPr>
-              <w:pStyle w:val="TableParagraph"/>
-              <w:rPr>
-                <w:rFonts w:asciiTheme="minorHAnsi" w:hAnsiTheme="minorHAnsi" w:cstheme="minorHAnsi"/>
-                <w:sz w:val="28"/>
-                <w:szCs w:val="28"/>
-              </w:rPr>
-            </w:pPr>
-          </w:p>
-        </w:tc>
-      </w:tr>
-    </w:tbl>
-    <w:p>
-      <w:pPr>
-        <w:pStyle w:val="TableParagraph"/>
-        <w:ind w:left="1"/>
-        <w:jc w:val="center"/>
-        <w:rPr>
-          <w:sz w:val="28"/>
-          <w:szCs w:val="28"/>
-        </w:rPr>
-        <w:sectPr>
-          <w:pgSz w:w="11913" w:h="8789"/>
-          <w:pgMar w:top="142" w:right="573" w:bottom="278" w:left="697" w:header="720" w:footer="720" w:gutter="0"/>
-          <w:cols w:space="720"/>
-        </w:sectPr>
-      </w:pPr>
-    </w:p>
-    <w:tbl>
-      <w:tblPr>
-        <w:tblW w:w="11340" w:type="dxa"/>
-        <w:tblInd w:w="-562" w:type="dxa"/>
-        <w:tblLayout w:type="fixed"/>
-        <w:tblCellMar>
-          <w:left w:w="0" w:type="dxa"/>
-          <w:right w:w="0" w:type="dxa"/>
-        </w:tblCellMar>
-        <w:tblLook w:val="01E0" w:firstRow="1" w:lastRow="1" w:firstColumn="1" w:lastColumn="1" w:noHBand="0" w:noVBand="0"/>
-      </w:tblPr>
-      <w:tblGrid>
-        <w:gridCol w:w="993"/>
-        <w:gridCol w:w="10347"/>
-      </w:tblGrid>
-      <w:tr>
-        <w:trPr>
-          <w:trHeight w:val="20"/>
-        </w:trPr>
-        <w:tc>
-          <w:tcPr>
-            <w:tcW w:w="993" w:type="dxa"/>
-          </w:tcPr>
-          <w:p>
-            <w:pPr>
-              <w:pStyle w:val="TableParagraph"/>
-              <w:ind w:left="1"/>
-              <w:jc w:val="center"/>
-              <w:rPr>
-                <w:rFonts w:asciiTheme="minorHAnsi" w:hAnsiTheme="minorHAnsi" w:cstheme="minorHAnsi"/>
-                <w:b/>
-                <w:bCs/>
-                <w:color w:val="FF0000"/>
-                <w:sz w:val="28"/>
-                <w:szCs w:val="28"/>
-              </w:rPr>
-            </w:pPr>
-            <w:r>
-              <w:rPr>
-                <w:b/>
-                <w:bCs/>
-                <w:sz w:val="28"/>
-                <w:szCs w:val="28"/>
-              </w:rPr>
-              <w:lastRenderedPageBreak/>
-              <w:t>14</w:t>
-            </w:r>
-          </w:p>
-        </w:tc>
-        <w:tc>
-          <w:tcPr>
-            <w:tcW w:w="10347" w:type="dxa"/>
-          </w:tcPr>
-          <w:p>
-            <w:pPr>
-              <w:pStyle w:val="TableParagraph"/>
-              <w:rPr>
-                <w:rFonts w:asciiTheme="minorHAnsi" w:hAnsiTheme="minorHAnsi" w:cstheme="minorHAnsi"/>
-                <w:b/>
-                <w:bCs/>
-                <w:sz w:val="28"/>
-                <w:szCs w:val="28"/>
-              </w:rPr>
-            </w:pPr>
-          </w:p>
-        </w:tc>
-      </w:tr>
-      <w:tr>
-        <w:trPr>
-          <w:trHeight w:val="20"/>
-        </w:trPr>
-        <w:tc>
-          <w:tcPr>
-            <w:tcW w:w="993" w:type="dxa"/>
-          </w:tcPr>
-          <w:p>
-            <w:pPr>
-              <w:pStyle w:val="TableParagraph"/>
-              <w:ind w:left="1"/>
-              <w:jc w:val="center"/>
-              <w:rPr>
-                <w:rFonts w:asciiTheme="minorHAnsi" w:hAnsiTheme="minorHAnsi" w:cstheme="minorHAnsi"/>
-                <w:b/>
-                <w:bCs/>
-                <w:color w:val="FF0000"/>
-                <w:sz w:val="28"/>
-                <w:szCs w:val="28"/>
-              </w:rPr>
-            </w:pPr>
-            <w:r>
-              <w:rPr>
-                <w:rFonts w:asciiTheme="minorHAnsi" w:hAnsiTheme="minorHAnsi" w:cstheme="minorHAnsi"/>
-                <w:b/>
-                <w:bCs/>
-                <w:color w:val="FF0000"/>
-                <w:sz w:val="28"/>
-                <w:szCs w:val="28"/>
-              </w:rPr>
-              <w:t>Ans.14)</w:t>
-            </w:r>
-          </w:p>
-        </w:tc>
-        <w:tc>
-          <w:tcPr>
-            <w:tcW w:w="10347" w:type="dxa"/>
-          </w:tcPr>
-          <w:p>
-            <w:pPr>
-              <w:pStyle w:val="TableParagraph"/>
-              <w:rPr>
-                <w:rFonts w:asciiTheme="minorHAnsi" w:hAnsiTheme="minorHAnsi" w:cstheme="minorHAnsi"/>
-                <w:sz w:val="28"/>
-                <w:szCs w:val="28"/>
-              </w:rPr>
-            </w:pPr>
-          </w:p>
-        </w:tc>
-      </w:tr>
-    </w:tbl>
-    <w:p>
-      <w:pPr>
-        <w:pStyle w:val="TableParagraph"/>
-        <w:ind w:left="1"/>
-        <w:jc w:val="center"/>
-        <w:rPr>
-          <w:sz w:val="28"/>
-          <w:szCs w:val="28"/>
-        </w:rPr>
-        <w:sectPr>
-          <w:pgSz w:w="11913" w:h="10206"/>
-          <w:pgMar w:top="142" w:right="573" w:bottom="278" w:left="697" w:header="720" w:footer="720" w:gutter="0"/>
-          <w:cols w:space="720"/>
-        </w:sectPr>
-      </w:pPr>
-    </w:p>
-    <w:tbl>
-      <w:tblPr>
-        <w:tblW w:w="11340" w:type="dxa"/>
-        <w:tblInd w:w="-562" w:type="dxa"/>
-        <w:tblLayout w:type="fixed"/>
-        <w:tblCellMar>
-          <w:left w:w="0" w:type="dxa"/>
-          <w:right w:w="0" w:type="dxa"/>
-        </w:tblCellMar>
-        <w:tblLook w:val="01E0" w:firstRow="1" w:lastRow="1" w:firstColumn="1" w:lastColumn="1" w:noHBand="0" w:noVBand="0"/>
-      </w:tblPr>
-      <w:tblGrid>
-        <w:gridCol w:w="993"/>
-        <w:gridCol w:w="10347"/>
-      </w:tblGrid>
-      <w:tr>
-        <w:trPr>
-          <w:trHeight w:val="20"/>
-        </w:trPr>
-        <w:tc>
-          <w:tcPr>
-            <w:tcW w:w="993" w:type="dxa"/>
-          </w:tcPr>
-          <w:p>
-            <w:pPr>
-              <w:pStyle w:val="TableParagraph"/>
-              <w:ind w:left="1"/>
-              <w:jc w:val="center"/>
-              <w:rPr>
-                <w:rFonts w:asciiTheme="minorHAnsi" w:hAnsiTheme="minorHAnsi" w:cstheme="minorHAnsi"/>
-                <w:b/>
-                <w:bCs/>
-                <w:color w:val="FF0000"/>
-                <w:sz w:val="28"/>
-                <w:szCs w:val="28"/>
-              </w:rPr>
-            </w:pPr>
-            <w:r>
-              <w:rPr>
-                <w:b/>
-                <w:bCs/>
-                <w:sz w:val="28"/>
-                <w:szCs w:val="28"/>
-              </w:rPr>
-              <w:lastRenderedPageBreak/>
-              <w:t>15</w:t>
-            </w:r>
-          </w:p>
-        </w:tc>
-        <w:tc>
-          <w:tcPr>
-            <w:tcW w:w="10347" w:type="dxa"/>
-          </w:tcPr>
-          <w:p>
-            <w:pPr>
-              <w:pStyle w:val="TableParagraph"/>
-              <w:rPr>
-                <w:rFonts w:asciiTheme="minorHAnsi" w:hAnsiTheme="minorHAnsi" w:cstheme="minorHAnsi"/>
-                <w:b/>
-                <w:bCs/>
-                <w:sz w:val="28"/>
-                <w:szCs w:val="28"/>
-              </w:rPr>
-            </w:pPr>
-          </w:p>
-        </w:tc>
-      </w:tr>
-      <w:tr>
-        <w:trPr>
-          <w:trHeight w:val="20"/>
-        </w:trPr>
-        <w:tc>
-          <w:tcPr>
-            <w:tcW w:w="993" w:type="dxa"/>
-          </w:tcPr>
-          <w:p>
-            <w:pPr>
-              <w:pStyle w:val="TableParagraph"/>
-              <w:ind w:left="1"/>
-              <w:jc w:val="center"/>
-              <w:rPr>
-                <w:rFonts w:asciiTheme="minorHAnsi" w:hAnsiTheme="minorHAnsi" w:cstheme="minorHAnsi"/>
-                <w:b/>
-                <w:bCs/>
-                <w:color w:val="FF0000"/>
-                <w:sz w:val="28"/>
-                <w:szCs w:val="28"/>
-              </w:rPr>
-            </w:pPr>
-            <w:r>
-              <w:rPr>
-                <w:rFonts w:asciiTheme="minorHAnsi" w:hAnsiTheme="minorHAnsi" w:cstheme="minorHAnsi"/>
-                <w:b/>
-                <w:bCs/>
-                <w:color w:val="FF0000"/>
-                <w:sz w:val="28"/>
-                <w:szCs w:val="28"/>
-              </w:rPr>
-              <w:t>Ans.15)</w:t>
-            </w:r>
-          </w:p>
-        </w:tc>
-        <w:tc>
-          <w:tcPr>
-            <w:tcW w:w="10347" w:type="dxa"/>
-          </w:tcPr>
-          <w:p>
-            <w:pPr>
-              <w:pStyle w:val="TableParagraph"/>
-              <w:rPr>
-                <w:rFonts w:asciiTheme="minorHAnsi" w:hAnsiTheme="minorHAnsi" w:cstheme="minorHAnsi"/>
-                <w:sz w:val="28"/>
-                <w:szCs w:val="28"/>
-              </w:rPr>
-            </w:pPr>
-          </w:p>
-        </w:tc>
-      </w:tr>
-    </w:tbl>
-    <w:p>
-      <w:pPr>
-        <w:pStyle w:val="TableParagraph"/>
-        <w:ind w:left="1"/>
-        <w:jc w:val="center"/>
-        <w:rPr>
-          <w:b/>
-          <w:bCs/>
-          <w:sz w:val="28"/>
-          <w:szCs w:val="28"/>
-        </w:rPr>
-        <w:sectPr>
-          <w:pgSz w:w="11913" w:h="10773"/>
-          <w:pgMar w:top="142" w:right="573" w:bottom="278" w:left="697" w:header="720" w:footer="720" w:gutter="0"/>
-          <w:cols w:space="720"/>
-        </w:sectPr>
-      </w:pPr>
-    </w:p>
-    <w:tbl>
-      <w:tblPr>
-        <w:tblW w:w="11340" w:type="dxa"/>
-        <w:tblInd w:w="-562" w:type="dxa"/>
-        <w:tblLayout w:type="fixed"/>
-        <w:tblCellMar>
-          <w:left w:w="0" w:type="dxa"/>
-          <w:right w:w="0" w:type="dxa"/>
-        </w:tblCellMar>
-        <w:tblLook w:val="01E0" w:firstRow="1" w:lastRow="1" w:firstColumn="1" w:lastColumn="1" w:noHBand="0" w:noVBand="0"/>
-      </w:tblPr>
-      <w:tblGrid>
-        <w:gridCol w:w="993"/>
-        <w:gridCol w:w="10347"/>
-      </w:tblGrid>
-      <w:tr>
-        <w:trPr>
-          <w:trHeight w:val="20"/>
-        </w:trPr>
-        <w:tc>
-          <w:tcPr>
-            <w:tcW w:w="993" w:type="dxa"/>
-          </w:tcPr>
-          <w:p>
-            <w:pPr>
-              <w:pStyle w:val="TableParagraph"/>
-              <w:ind w:left="1"/>
-              <w:jc w:val="center"/>
-              <w:rPr>
-                <w:rFonts w:asciiTheme="minorHAnsi" w:hAnsiTheme="minorHAnsi" w:cstheme="minorHAnsi"/>
-                <w:b/>
-                <w:bCs/>
-                <w:color w:val="FF0000"/>
-                <w:sz w:val="28"/>
-                <w:szCs w:val="28"/>
-              </w:rPr>
-            </w:pPr>
-            <w:r>
-              <w:rPr>
-                <w:b/>
-                <w:bCs/>
-                <w:sz w:val="28"/>
-                <w:szCs w:val="28"/>
-              </w:rPr>
-              <w:lastRenderedPageBreak/>
-              <w:t>16</w:t>
-            </w:r>
-          </w:p>
-        </w:tc>
-        <w:tc>
-          <w:tcPr>
-            <w:tcW w:w="10347" w:type="dxa"/>
-          </w:tcPr>
-          <w:p>
-            <w:pPr>
-              <w:pStyle w:val="TableParagraph"/>
-              <w:rPr>
-                <w:rFonts w:asciiTheme="minorHAnsi" w:hAnsiTheme="minorHAnsi" w:cstheme="minorHAnsi"/>
-                <w:b/>
-                <w:bCs/>
-                <w:sz w:val="28"/>
-                <w:szCs w:val="28"/>
-              </w:rPr>
-            </w:pPr>
-          </w:p>
-        </w:tc>
-      </w:tr>
-      <w:tr>
-        <w:trPr>
-          <w:trHeight w:val="20"/>
-        </w:trPr>
-        <w:tc>
-          <w:tcPr>
-            <w:tcW w:w="993" w:type="dxa"/>
-          </w:tcPr>
-          <w:p>
-            <w:pPr>
-              <w:pStyle w:val="TableParagraph"/>
-              <w:ind w:left="1"/>
-              <w:jc w:val="center"/>
-              <w:rPr>
-                <w:rFonts w:asciiTheme="minorHAnsi" w:hAnsiTheme="minorHAnsi" w:cstheme="minorHAnsi"/>
-                <w:b/>
-                <w:bCs/>
-                <w:color w:val="FF0000"/>
-                <w:sz w:val="28"/>
-                <w:szCs w:val="28"/>
-              </w:rPr>
-            </w:pPr>
-            <w:r>
-              <w:rPr>
-                <w:rFonts w:asciiTheme="minorHAnsi" w:hAnsiTheme="minorHAnsi" w:cstheme="minorHAnsi"/>
-                <w:b/>
-                <w:bCs/>
-                <w:color w:val="FF0000"/>
-                <w:sz w:val="28"/>
-                <w:szCs w:val="28"/>
-              </w:rPr>
-              <w:t>Ans.16)</w:t>
-            </w:r>
-          </w:p>
-        </w:tc>
-        <w:tc>
-          <w:tcPr>
-            <w:tcW w:w="10347" w:type="dxa"/>
-          </w:tcPr>
-          <w:p>
-            <w:pPr>
-              <w:pStyle w:val="TableParagraph"/>
-              <w:rPr>
-                <w:rFonts w:asciiTheme="minorHAnsi" w:hAnsiTheme="minorHAnsi" w:cstheme="minorHAnsi"/>
-                <w:sz w:val="28"/>
-                <w:szCs w:val="28"/>
-              </w:rPr>
-            </w:pPr>
-          </w:p>
-        </w:tc>
-      </w:tr>
-    </w:tbl>
-    <w:p>
-      <w:pPr>
-        <w:pStyle w:val="TableParagraph"/>
-        <w:ind w:left="1"/>
-        <w:jc w:val="center"/>
-        <w:rPr>
-          <w:sz w:val="28"/>
-          <w:szCs w:val="28"/>
-        </w:rPr>
-        <w:sectPr>
-          <w:pgSz w:w="11913" w:h="11340"/>
-          <w:pgMar w:top="142" w:right="573" w:bottom="0" w:left="697" w:header="720" w:footer="720" w:gutter="0"/>
-          <w:cols w:space="720"/>
-        </w:sectPr>
-      </w:pPr>
-    </w:p>
-    <w:tbl>
-      <w:tblPr>
-        <w:tblW w:w="11340" w:type="dxa"/>
-        <w:tblInd w:w="-562" w:type="dxa"/>
-        <w:tblLayout w:type="fixed"/>
-        <w:tblCellMar>
-          <w:left w:w="0" w:type="dxa"/>
-          <w:right w:w="0" w:type="dxa"/>
-        </w:tblCellMar>
-        <w:tblLook w:val="01E0" w:firstRow="1" w:lastRow="1" w:firstColumn="1" w:lastColumn="1" w:noHBand="0" w:noVBand="0"/>
-      </w:tblPr>
-      <w:tblGrid>
-        <w:gridCol w:w="993"/>
-        <w:gridCol w:w="10347"/>
-      </w:tblGrid>
-      <w:tr>
-        <w:trPr>
-          <w:trHeight w:val="20"/>
-        </w:trPr>
-        <w:tc>
-          <w:tcPr>
-            <w:tcW w:w="993" w:type="dxa"/>
-          </w:tcPr>
-          <w:p>
-            <w:pPr>
-              <w:pStyle w:val="TableParagraph"/>
-              <w:ind w:left="1"/>
-              <w:jc w:val="center"/>
-              <w:rPr>
-                <w:rFonts w:asciiTheme="minorHAnsi" w:hAnsiTheme="minorHAnsi" w:cstheme="minorHAnsi"/>
-                <w:b/>
-                <w:bCs/>
-                <w:color w:val="FF0000"/>
-                <w:sz w:val="28"/>
-                <w:szCs w:val="28"/>
-              </w:rPr>
-            </w:pPr>
-            <w:r>
-              <w:rPr>
-                <w:b/>
-                <w:bCs/>
-                <w:sz w:val="28"/>
-                <w:szCs w:val="28"/>
-              </w:rPr>
-              <w:lastRenderedPageBreak/>
-              <w:t>17</w:t>
-            </w:r>
-          </w:p>
-        </w:tc>
-        <w:tc>
-          <w:tcPr>
-            <w:tcW w:w="10347" w:type="dxa"/>
-          </w:tcPr>
-          <w:p>
-            <w:pPr>
-              <w:pStyle w:val="TableParagraph"/>
-              <w:rPr>
-                <w:rFonts w:asciiTheme="minorHAnsi" w:hAnsiTheme="minorHAnsi" w:cstheme="minorHAnsi"/>
-                <w:b/>
-                <w:bCs/>
-                <w:sz w:val="28"/>
-                <w:szCs w:val="28"/>
-              </w:rPr>
-            </w:pPr>
-          </w:p>
-        </w:tc>
-      </w:tr>
-      <w:tr>
-        <w:trPr>
-          <w:trHeight w:val="20"/>
-        </w:trPr>
-        <w:tc>
-          <w:tcPr>
-            <w:tcW w:w="993" w:type="dxa"/>
-          </w:tcPr>
-          <w:p>
-            <w:pPr>
-              <w:pStyle w:val="TableParagraph"/>
-              <w:ind w:left="1"/>
-              <w:jc w:val="center"/>
-              <w:rPr>
-                <w:rFonts w:asciiTheme="minorHAnsi" w:hAnsiTheme="minorHAnsi" w:cstheme="minorHAnsi"/>
-                <w:b/>
-                <w:bCs/>
-                <w:color w:val="FF0000"/>
-                <w:sz w:val="28"/>
-                <w:szCs w:val="28"/>
-              </w:rPr>
-            </w:pPr>
-            <w:r>
-              <w:rPr>
-                <w:rFonts w:asciiTheme="minorHAnsi" w:hAnsiTheme="minorHAnsi" w:cstheme="minorHAnsi"/>
-                <w:b/>
-                <w:bCs/>
-                <w:color w:val="FF0000"/>
-                <w:sz w:val="28"/>
-                <w:szCs w:val="28"/>
-              </w:rPr>
-              <w:t>Ans.17)</w:t>
-            </w:r>
-          </w:p>
-        </w:tc>
-        <w:tc>
-          <w:tcPr>
-            <w:tcW w:w="10347" w:type="dxa"/>
-          </w:tcPr>
-          <w:p>
-            <w:pPr>
-              <w:pStyle w:val="TableParagraph"/>
-              <w:rPr>
-                <w:rFonts w:asciiTheme="minorHAnsi" w:hAnsiTheme="minorHAnsi" w:cstheme="minorHAnsi"/>
-                <w:sz w:val="28"/>
-                <w:szCs w:val="28"/>
-              </w:rPr>
-            </w:pPr>
-          </w:p>
-        </w:tc>
-      </w:tr>
-    </w:tbl>
-    <w:p>
-      <w:pPr>
-        <w:pStyle w:val="TableParagraph"/>
-        <w:ind w:left="1"/>
-        <w:jc w:val="center"/>
-        <w:rPr>
-          <w:sz w:val="28"/>
-          <w:szCs w:val="28"/>
-        </w:rPr>
-        <w:sectPr>
-          <w:pgSz w:w="11913" w:h="12474"/>
-          <w:pgMar w:top="142" w:right="573" w:bottom="278" w:left="697" w:header="720" w:footer="720" w:gutter="0"/>
-          <w:cols w:space="720"/>
-        </w:sectPr>
-      </w:pPr>
-    </w:p>
-    <w:tbl>
-      <w:tblPr>
-        <w:tblW w:w="11340" w:type="dxa"/>
-        <w:tblInd w:w="-562" w:type="dxa"/>
-        <w:tblLayout w:type="fixed"/>
-        <w:tblCellMar>
-          <w:left w:w="0" w:type="dxa"/>
-          <w:right w:w="0" w:type="dxa"/>
-        </w:tblCellMar>
-        <w:tblLook w:val="01E0" w:firstRow="1" w:lastRow="1" w:firstColumn="1" w:lastColumn="1" w:noHBand="0" w:noVBand="0"/>
-      </w:tblPr>
-      <w:tblGrid>
-        <w:gridCol w:w="993"/>
-        <w:gridCol w:w="10347"/>
-      </w:tblGrid>
-      <w:tr>
-        <w:trPr>
-          <w:trHeight w:val="20"/>
-        </w:trPr>
-        <w:tc>
-          <w:tcPr>
-            <w:tcW w:w="993" w:type="dxa"/>
-          </w:tcPr>
-          <w:p>
-            <w:pPr>
-              <w:pStyle w:val="TableParagraph"/>
-              <w:ind w:left="1"/>
-              <w:jc w:val="center"/>
-              <w:rPr>
-                <w:rFonts w:asciiTheme="minorHAnsi" w:hAnsiTheme="minorHAnsi" w:cstheme="minorHAnsi"/>
-                <w:b/>
-                <w:bCs/>
-                <w:color w:val="FF0000"/>
-                <w:sz w:val="28"/>
-                <w:szCs w:val="28"/>
-              </w:rPr>
-            </w:pPr>
-            <w:r>
-              <w:rPr>
-                <w:b/>
-                <w:bCs/>
-                <w:sz w:val="28"/>
-                <w:szCs w:val="28"/>
-              </w:rPr>
-              <w:lastRenderedPageBreak/>
-              <w:t>18</w:t>
-            </w:r>
-          </w:p>
-        </w:tc>
-        <w:tc>
-          <w:tcPr>
-            <w:tcW w:w="10347" w:type="dxa"/>
-          </w:tcPr>
-          <w:p>
-            <w:pPr>
-              <w:pStyle w:val="TableParagraph"/>
-              <w:rPr>
-                <w:rFonts w:asciiTheme="minorHAnsi" w:hAnsiTheme="minorHAnsi" w:cstheme="minorHAnsi"/>
-                <w:b/>
-                <w:bCs/>
-                <w:sz w:val="28"/>
-                <w:szCs w:val="28"/>
-              </w:rPr>
-            </w:pPr>
-          </w:p>
-        </w:tc>
-      </w:tr>
-      <w:tr>
-        <w:trPr>
-          <w:trHeight w:val="20"/>
-        </w:trPr>
-        <w:tc>
-          <w:tcPr>
-            <w:tcW w:w="993" w:type="dxa"/>
-          </w:tcPr>
-          <w:p>
-            <w:pPr>
-              <w:pStyle w:val="TableParagraph"/>
-              <w:ind w:left="1"/>
-              <w:jc w:val="center"/>
-              <w:rPr>
-                <w:rFonts w:asciiTheme="minorHAnsi" w:hAnsiTheme="minorHAnsi" w:cstheme="minorHAnsi"/>
-                <w:b/>
-                <w:bCs/>
-                <w:color w:val="FF0000"/>
-                <w:sz w:val="28"/>
-                <w:szCs w:val="28"/>
-              </w:rPr>
-            </w:pPr>
-            <w:r>
-              <w:rPr>
-                <w:rFonts w:asciiTheme="minorHAnsi" w:hAnsiTheme="minorHAnsi" w:cstheme="minorHAnsi"/>
-                <w:b/>
-                <w:bCs/>
-                <w:color w:val="FF0000"/>
-                <w:sz w:val="28"/>
-                <w:szCs w:val="28"/>
-              </w:rPr>
-              <w:t>Ans.18)</w:t>
-            </w:r>
-          </w:p>
-        </w:tc>
-        <w:tc>
-          <w:tcPr>
-            <w:tcW w:w="10347" w:type="dxa"/>
-          </w:tcPr>
-          <w:p>
-            <w:pPr>
-              <w:pStyle w:val="TableParagraph"/>
-              <w:rPr>
-                <w:rFonts w:asciiTheme="minorHAnsi" w:hAnsiTheme="minorHAnsi" w:cstheme="minorHAnsi"/>
-                <w:sz w:val="28"/>
-                <w:szCs w:val="28"/>
-              </w:rPr>
-            </w:pPr>
-          </w:p>
-        </w:tc>
-      </w:tr>
-    </w:tbl>
-    <w:p>
-      <w:pPr>
-        <w:pStyle w:val="TableParagraph"/>
-        <w:ind w:left="1"/>
-        <w:jc w:val="center"/>
-        <w:rPr>
-          <w:sz w:val="28"/>
-          <w:szCs w:val="28"/>
-        </w:rPr>
-        <w:sectPr>
-          <w:pgSz w:w="11913" w:h="8505"/>
-          <w:pgMar w:top="142" w:right="573" w:bottom="0" w:left="697" w:header="720" w:footer="720" w:gutter="0"/>
-          <w:cols w:space="720"/>
-        </w:sectPr>
-      </w:pPr>
-    </w:p>
-    <w:tbl>
-      <w:tblPr>
-        <w:tblW w:w="11340" w:type="dxa"/>
-        <w:tblInd w:w="-562" w:type="dxa"/>
-        <w:tblLayout w:type="fixed"/>
-        <w:tblCellMar>
-          <w:left w:w="0" w:type="dxa"/>
-          <w:right w:w="0" w:type="dxa"/>
-        </w:tblCellMar>
-        <w:tblLook w:val="01E0" w:firstRow="1" w:lastRow="1" w:firstColumn="1" w:lastColumn="1" w:noHBand="0" w:noVBand="0"/>
-      </w:tblPr>
-      <w:tblGrid>
-        <w:gridCol w:w="993"/>
-        <w:gridCol w:w="10347"/>
-      </w:tblGrid>
-      <w:tr>
-        <w:trPr>
-          <w:trHeight w:val="20"/>
-        </w:trPr>
-        <w:tc>
-          <w:tcPr>
-            <w:tcW w:w="993" w:type="dxa"/>
-          </w:tcPr>
-          <w:p>
-            <w:pPr>
-              <w:pStyle w:val="TableParagraph"/>
-              <w:ind w:left="1"/>
-              <w:jc w:val="center"/>
-              <w:rPr>
-                <w:rFonts w:asciiTheme="minorHAnsi" w:hAnsiTheme="minorHAnsi" w:cstheme="minorHAnsi"/>
-                <w:b/>
-                <w:bCs/>
-                <w:color w:val="FF0000"/>
-                <w:sz w:val="28"/>
-                <w:szCs w:val="28"/>
-              </w:rPr>
-            </w:pPr>
-            <w:r>
-              <w:rPr>
-                <w:b/>
-                <w:bCs/>
-                <w:sz w:val="28"/>
-                <w:szCs w:val="28"/>
-              </w:rPr>
-              <w:lastRenderedPageBreak/>
-              <w:t>19</w:t>
-            </w:r>
-          </w:p>
-        </w:tc>
-        <w:tc>
-          <w:tcPr>
-            <w:tcW w:w="10347" w:type="dxa"/>
-          </w:tcPr>
-          <w:p>
-            <w:pPr>
-              <w:pStyle w:val="TableParagraph"/>
-              <w:rPr>
-                <w:rFonts w:asciiTheme="minorHAnsi" w:hAnsiTheme="minorHAnsi" w:cstheme="minorHAnsi"/>
-                <w:b/>
-                <w:bCs/>
-                <w:sz w:val="28"/>
-                <w:szCs w:val="28"/>
-              </w:rPr>
-            </w:pPr>
-          </w:p>
-        </w:tc>
-      </w:tr>
-      <w:tr>
-        <w:trPr>
-          <w:trHeight w:val="20"/>
-        </w:trPr>
-        <w:tc>
-          <w:tcPr>
-            <w:tcW w:w="993" w:type="dxa"/>
-          </w:tcPr>
-          <w:p>
-            <w:pPr>
-              <w:pStyle w:val="TableParagraph"/>
-              <w:ind w:left="1"/>
-              <w:jc w:val="center"/>
-              <w:rPr>
-                <w:rFonts w:asciiTheme="minorHAnsi" w:hAnsiTheme="minorHAnsi" w:cstheme="minorHAnsi"/>
-                <w:b/>
-                <w:bCs/>
-                <w:color w:val="FF0000"/>
-                <w:sz w:val="28"/>
-                <w:szCs w:val="28"/>
-              </w:rPr>
-            </w:pPr>
-            <w:r>
-              <w:rPr>
-                <w:rFonts w:asciiTheme="minorHAnsi" w:hAnsiTheme="minorHAnsi" w:cstheme="minorHAnsi"/>
-                <w:b/>
-                <w:bCs/>
-                <w:color w:val="FF0000"/>
-                <w:sz w:val="28"/>
-                <w:szCs w:val="28"/>
-              </w:rPr>
-              <w:t>Ans.19)</w:t>
-            </w:r>
-          </w:p>
-        </w:tc>
-        <w:tc>
-          <w:tcPr>
-            <w:tcW w:w="10347" w:type="dxa"/>
-          </w:tcPr>
-          <w:p>
-            <w:pPr>
-              <w:pStyle w:val="TableParagraph"/>
-              <w:rPr>
-                <w:rFonts w:asciiTheme="minorHAnsi" w:hAnsiTheme="minorHAnsi" w:cstheme="minorHAnsi"/>
-                <w:sz w:val="28"/>
-                <w:szCs w:val="28"/>
-              </w:rPr>
-            </w:pPr>
-          </w:p>
-        </w:tc>
-      </w:tr>
-    </w:tbl>
-    <w:p/>
     <w:sectPr>
       <w:pgSz w:w="11913" w:h="13041"/>
       <w:pgMar w:top="0" w:right="1480" w:bottom="0" w:left="697" w:header="720" w:footer="720" w:gutter="0"/>
@@ -3864,6 +2438,124 @@
         </w:tabs>
         <w:ind w:left="6480" w:hanging="360"/>
       </w:pPr>
+    </w:lvl>
+  </w:abstractNum>
+  <w:abstractNum w:abstractNumId="8" w15:restartNumberingAfterBreak="0">
+    <w:nsid w:val="7CC43D3B"/>
+    <w:multiLevelType w:val="hybridMultilevel"/>
+    <w:tmpl w:val="A5702706"/>
+    <w:lvl w:ilvl="0" w:tplc="71346E7C">
+      <w:start w:val="1"/>
+      <w:numFmt w:val="decimal"/>
+      <w:lvlText w:val="%1)"/>
+      <w:lvlJc w:val="left"/>
+      <w:pPr>
+        <w:ind w:left="860" w:hanging="360"/>
+      </w:pPr>
+      <w:rPr>
+        <w:rFonts w:ascii="Trebuchet MS" w:eastAsia="Trebuchet MS" w:hAnsi="Trebuchet MS" w:cs="Trebuchet MS" w:hint="default"/>
+        <w:spacing w:val="-2"/>
+        <w:w w:val="96"/>
+        <w:sz w:val="22"/>
+        <w:szCs w:val="22"/>
+        <w:lang w:val="en-US" w:eastAsia="en-US" w:bidi="ar-SA"/>
+      </w:rPr>
+    </w:lvl>
+    <w:lvl w:ilvl="1" w:tplc="2124D656">
+      <w:numFmt w:val="bullet"/>
+      <w:lvlText w:val="•"/>
+      <w:lvlJc w:val="left"/>
+      <w:pPr>
+        <w:ind w:left="1852" w:hanging="360"/>
+      </w:pPr>
+      <w:rPr>
+        <w:rFonts w:hint="default"/>
+        <w:lang w:val="en-US" w:eastAsia="en-US" w:bidi="ar-SA"/>
+      </w:rPr>
+    </w:lvl>
+    <w:lvl w:ilvl="2" w:tplc="3058F9E4">
+      <w:numFmt w:val="bullet"/>
+      <w:lvlText w:val="•"/>
+      <w:lvlJc w:val="left"/>
+      <w:pPr>
+        <w:ind w:left="2844" w:hanging="360"/>
+      </w:pPr>
+      <w:rPr>
+        <w:rFonts w:hint="default"/>
+        <w:lang w:val="en-US" w:eastAsia="en-US" w:bidi="ar-SA"/>
+      </w:rPr>
+    </w:lvl>
+    <w:lvl w:ilvl="3" w:tplc="37422718">
+      <w:numFmt w:val="bullet"/>
+      <w:lvlText w:val="•"/>
+      <w:lvlJc w:val="left"/>
+      <w:pPr>
+        <w:ind w:left="3836" w:hanging="360"/>
+      </w:pPr>
+      <w:rPr>
+        <w:rFonts w:hint="default"/>
+        <w:lang w:val="en-US" w:eastAsia="en-US" w:bidi="ar-SA"/>
+      </w:rPr>
+    </w:lvl>
+    <w:lvl w:ilvl="4" w:tplc="3D986EAA">
+      <w:numFmt w:val="bullet"/>
+      <w:lvlText w:val="•"/>
+      <w:lvlJc w:val="left"/>
+      <w:pPr>
+        <w:ind w:left="4828" w:hanging="360"/>
+      </w:pPr>
+      <w:rPr>
+        <w:rFonts w:hint="default"/>
+        <w:lang w:val="en-US" w:eastAsia="en-US" w:bidi="ar-SA"/>
+      </w:rPr>
+    </w:lvl>
+    <w:lvl w:ilvl="5" w:tplc="D3F635E8">
+      <w:numFmt w:val="bullet"/>
+      <w:lvlText w:val="•"/>
+      <w:lvlJc w:val="left"/>
+      <w:pPr>
+        <w:ind w:left="5820" w:hanging="360"/>
+      </w:pPr>
+      <w:rPr>
+        <w:rFonts w:hint="default"/>
+        <w:lang w:val="en-US" w:eastAsia="en-US" w:bidi="ar-SA"/>
+      </w:rPr>
+    </w:lvl>
+    <w:lvl w:ilvl="6" w:tplc="90BC22EC">
+      <w:numFmt w:val="bullet"/>
+      <w:lvlText w:val="•"/>
+      <w:lvlJc w:val="left"/>
+      <w:pPr>
+        <w:ind w:left="6812" w:hanging="360"/>
+      </w:pPr>
+      <w:rPr>
+        <w:rFonts w:hint="default"/>
+        <w:lang w:val="en-US" w:eastAsia="en-US" w:bidi="ar-SA"/>
+      </w:rPr>
+    </w:lvl>
+    <w:lvl w:ilvl="7" w:tplc="24206C7E">
+      <w:numFmt w:val="bullet"/>
+      <w:lvlText w:val="•"/>
+      <w:lvlJc w:val="left"/>
+      <w:pPr>
+        <w:ind w:left="7804" w:hanging="360"/>
+      </w:pPr>
+      <w:rPr>
+        <w:rFonts w:hint="default"/>
+        <w:lang w:val="en-US" w:eastAsia="en-US" w:bidi="ar-SA"/>
+      </w:rPr>
+    </w:lvl>
+    <w:lvl w:ilvl="8" w:tplc="817CDC86">
+      <w:numFmt w:val="bullet"/>
+      <w:lvlText w:val="•"/>
+      <w:lvlJc w:val="left"/>
+      <w:pPr>
+        <w:ind w:left="8796" w:hanging="360"/>
+      </w:pPr>
+      <w:rPr>
+        <w:rFonts w:hint="default"/>
+        <w:lang w:val="en-US" w:eastAsia="en-US" w:bidi="ar-SA"/>
+      </w:rPr>
     </w:lvl>
   </w:abstractNum>
   <w:num w:numId="1" w16cid:durableId="1330862168">
@@ -3889,6 +2581,9 @@
   </w:num>
   <w:num w:numId="8" w16cid:durableId="1855878255">
     <w:abstractNumId w:val="1"/>
+  </w:num>
+  <w:num w:numId="9" w16cid:durableId="116535797">
+    <w:abstractNumId w:val="8"/>
   </w:num>
 </w:numbering>
 </file>

</xml_diff>

<commit_message>
DAP QB Week 8 Ans FIx
</commit_message>
<xml_diff>
--- a/DAP - Data Analysis using Python/DAP_QB_ANS/DAP_QB_Week_8_Ans.docx
+++ b/DAP - Data Analysis using Python/DAP_QB_ANS/DAP_QB_Week_8_Ans.docx
@@ -740,27 +740,7 @@
                 <w:szCs w:val="28"/>
                 <w:lang w:val="en-IN"/>
               </w:rPr>
-              <w:t xml:space="preserve">Logistic regression is a statistical </w:t>
-            </w:r>
-            <w:proofErr w:type="spellStart"/>
-            <w:r>
-              <w:rPr>
-                <w:rFonts w:asciiTheme="minorHAnsi" w:hAnsiTheme="minorHAnsi" w:cstheme="minorHAnsi"/>
-                <w:sz w:val="28"/>
-                <w:szCs w:val="28"/>
-                <w:lang w:val="en-IN"/>
-              </w:rPr>
-              <w:t>modeling</w:t>
-            </w:r>
-            <w:proofErr w:type="spellEnd"/>
-            <w:r>
-              <w:rPr>
-                <w:rFonts w:asciiTheme="minorHAnsi" w:hAnsiTheme="minorHAnsi" w:cstheme="minorHAnsi"/>
-                <w:sz w:val="28"/>
-                <w:szCs w:val="28"/>
-                <w:lang w:val="en-IN"/>
-              </w:rPr>
-              <w:t xml:space="preserve"> technique used to predict the probability of a binary or categorical outcome variable based on one or more predictor variables. It is particularly useful when the dependent variable is dichotomous, meaning it can only take two possible values, such as "yes/no", "success/failure", or "approved/rejected".</w:t>
+              <w:t>Logistic regression is a statistical modeling technique used to predict the probability of a binary or categorical outcome variable based on one or more predictor variables. It is particularly useful when the dependent variable is dichotomous, meaning it can only take two possible values, such as "yes/no", "success/failure", or "approved/rejected".</w:t>
             </w:r>
           </w:p>
           <w:p>
@@ -907,31 +887,7 @@
                 <w:szCs w:val="28"/>
                 <w:lang w:val="en-IN"/>
               </w:rPr>
-              <w:t xml:space="preserve">Probability </w:t>
-            </w:r>
-            <w:proofErr w:type="spellStart"/>
-            <w:r>
-              <w:rPr>
-                <w:rFonts w:asciiTheme="minorHAnsi" w:hAnsiTheme="minorHAnsi" w:cstheme="minorHAnsi"/>
-                <w:b/>
-                <w:bCs/>
-                <w:sz w:val="28"/>
-                <w:szCs w:val="28"/>
-                <w:lang w:val="en-IN"/>
-              </w:rPr>
-              <w:t>modeling</w:t>
-            </w:r>
-            <w:proofErr w:type="spellEnd"/>
-            <w:r>
-              <w:rPr>
-                <w:rFonts w:asciiTheme="minorHAnsi" w:hAnsiTheme="minorHAnsi" w:cstheme="minorHAnsi"/>
-                <w:b/>
-                <w:bCs/>
-                <w:sz w:val="28"/>
-                <w:szCs w:val="28"/>
-                <w:lang w:val="en-IN"/>
-              </w:rPr>
-              <w:t>:</w:t>
+              <w:t>Probability modeling:</w:t>
             </w:r>
             <w:r>
               <w:rPr>
@@ -1613,27 +1569,7 @@
                 <w:szCs w:val="28"/>
                 <w:lang w:val="en-IN"/>
               </w:rPr>
-              <w:t xml:space="preserve">If the p-value is less than the chosen significance level (e.g., 0.05), you can conclude that the full model provides a significantly better fit to the data than the null model, and at least one of the predictors is significantly associated with the outcome </w:t>
-            </w:r>
-            <w:proofErr w:type="spellStart"/>
-            <w:r>
-              <w:rPr>
-                <w:rFonts w:asciiTheme="minorHAnsi" w:hAnsiTheme="minorHAnsi" w:cstheme="minorHAnsi"/>
-                <w:sz w:val="28"/>
-                <w:szCs w:val="28"/>
-                <w:lang w:val="en-IN"/>
-              </w:rPr>
-              <w:t>variable.The</w:t>
-            </w:r>
-            <w:proofErr w:type="spellEnd"/>
-            <w:r>
-              <w:rPr>
-                <w:rFonts w:asciiTheme="minorHAnsi" w:hAnsiTheme="minorHAnsi" w:cstheme="minorHAnsi"/>
-                <w:sz w:val="28"/>
-                <w:szCs w:val="28"/>
-                <w:lang w:val="en-IN"/>
-              </w:rPr>
-              <w:t xml:space="preserve"> G test is a useful tool in logistic regression to assess the overall model fit and to compare the fit of different models, which can help in selecting the most appropriate model for the data.</w:t>
+              <w:t>If the p-value is less than the chosen significance level (e.g., 0.05), you can conclude that the full model provides a significantly better fit to the data than the null model, and at least one of the predictors is significantly associated with the outcome variable.The G test is a useful tool in logistic regression to assess the overall model fit and to compare the fit of different models, which can help in selecting the most appropriate model for the data.</w:t>
             </w:r>
           </w:p>
         </w:tc>
@@ -1800,8 +1736,6 @@
                     <w:pStyle w:val="TableParagraph"/>
                     <w:rPr>
                       <w:rFonts w:asciiTheme="minorHAnsi" w:hAnsiTheme="minorHAnsi" w:cstheme="minorHAnsi"/>
-                      <w:b/>
-                      <w:bCs/>
                       <w:sz w:val="28"/>
                       <w:szCs w:val="28"/>
                       <w:lang w:val="en-IN"/>
@@ -1810,8 +1744,6 @@
                   <w:r>
                     <w:rPr>
                       <w:rFonts w:asciiTheme="minorHAnsi" w:hAnsiTheme="minorHAnsi" w:cstheme="minorHAnsi"/>
-                      <w:b/>
-                      <w:bCs/>
                       <w:sz w:val="28"/>
                       <w:szCs w:val="28"/>
                       <w:lang w:val="en-IN"/>
@@ -3054,7 +2986,6 @@
                 <w:lang w:val="en-IN"/>
               </w:rPr>
             </w:pPr>
-            <w:proofErr w:type="spellStart"/>
             <w:r>
               <w:rPr>
                 <w:rFonts w:asciiTheme="minorHAnsi" w:hAnsiTheme="minorHAnsi" w:cstheme="minorHAnsi"/>
@@ -3066,7 +2997,6 @@
               </w:rPr>
               <w:t>Modeling</w:t>
             </w:r>
-            <w:proofErr w:type="spellEnd"/>
             <w:r>
               <w:rPr>
                 <w:rFonts w:asciiTheme="minorHAnsi" w:hAnsiTheme="minorHAnsi" w:cstheme="minorHAnsi"/>
@@ -3720,7 +3650,7 @@
                 <w:szCs w:val="28"/>
               </w:rPr>
               <w:lastRenderedPageBreak/>
-              <w:t>7</w:t>
+              <w:t>S</w:t>
             </w:r>
           </w:p>
         </w:tc>
@@ -3756,7 +3686,7 @@
       </w:tr>
       <w:tr>
         <w:trPr>
-          <w:trHeight w:val="20"/>
+          <w:trHeight w:val="64"/>
         </w:trPr>
         <w:tc>
           <w:tcPr>
@@ -3796,14 +3726,14 @@
           <w:tbl>
             <w:tblPr>
               <w:tblStyle w:val="GridTable5Dark-Accent4"/>
-              <w:tblW w:w="0" w:type="auto"/>
+              <w:tblW w:w="10331" w:type="dxa"/>
               <w:tblLayout w:type="fixed"/>
               <w:tblLook w:val="04A0" w:firstRow="1" w:lastRow="0" w:firstColumn="1" w:lastColumn="0" w:noHBand="0" w:noVBand="1"/>
             </w:tblPr>
             <w:tblGrid>
-              <w:gridCol w:w="2091"/>
-              <w:gridCol w:w="4401"/>
-              <w:gridCol w:w="4838"/>
+              <w:gridCol w:w="1968"/>
+              <w:gridCol w:w="4111"/>
+              <w:gridCol w:w="4252"/>
             </w:tblGrid>
             <w:tr>
               <w:trPr>
@@ -3812,7 +3742,7 @@
               <w:tc>
                 <w:tcPr>
                   <w:cnfStyle w:val="001000000000" w:firstRow="0" w:lastRow="0" w:firstColumn="1" w:lastColumn="0" w:oddVBand="0" w:evenVBand="0" w:oddHBand="0" w:evenHBand="0" w:firstRowFirstColumn="0" w:firstRowLastColumn="0" w:lastRowFirstColumn="0" w:lastRowLastColumn="0"/>
-                  <w:tcW w:w="2091" w:type="dxa"/>
+                  <w:tcW w:w="1968" w:type="dxa"/>
                   <w:noWrap/>
                   <w:hideMark/>
                 </w:tcPr>
@@ -3839,7 +3769,7 @@
               </w:tc>
               <w:tc>
                 <w:tcPr>
-                  <w:tcW w:w="4401" w:type="dxa"/>
+                  <w:tcW w:w="4111" w:type="dxa"/>
                   <w:noWrap/>
                   <w:hideMark/>
                 </w:tcPr>
@@ -3867,7 +3797,7 @@
               </w:tc>
               <w:tc>
                 <w:tcPr>
-                  <w:tcW w:w="4838" w:type="dxa"/>
+                  <w:tcW w:w="4252" w:type="dxa"/>
                   <w:noWrap/>
                   <w:hideMark/>
                 </w:tcPr>
@@ -3901,7 +3831,7 @@
               <w:tc>
                 <w:tcPr>
                   <w:cnfStyle w:val="001000000000" w:firstRow="0" w:lastRow="0" w:firstColumn="1" w:lastColumn="0" w:oddVBand="0" w:evenVBand="0" w:oddHBand="0" w:evenHBand="0" w:firstRowFirstColumn="0" w:firstRowLastColumn="0" w:lastRowFirstColumn="0" w:lastRowLastColumn="0"/>
-                  <w:tcW w:w="2091" w:type="dxa"/>
+                  <w:tcW w:w="1968" w:type="dxa"/>
                   <w:hideMark/>
                 </w:tcPr>
                 <w:p>
@@ -3927,7 +3857,7 @@
               </w:tc>
               <w:tc>
                 <w:tcPr>
-                  <w:tcW w:w="4401" w:type="dxa"/>
+                  <w:tcW w:w="4111" w:type="dxa"/>
                   <w:hideMark/>
                 </w:tcPr>
                 <w:p>
@@ -3954,7 +3884,7 @@
               </w:tc>
               <w:tc>
                 <w:tcPr>
-                  <w:tcW w:w="4838" w:type="dxa"/>
+                  <w:tcW w:w="4252" w:type="dxa"/>
                   <w:hideMark/>
                 </w:tcPr>
                 <w:p>
@@ -3984,7 +3914,7 @@
               <w:tc>
                 <w:tcPr>
                   <w:cnfStyle w:val="001000000000" w:firstRow="0" w:lastRow="0" w:firstColumn="1" w:lastColumn="0" w:oddVBand="0" w:evenVBand="0" w:oddHBand="0" w:evenHBand="0" w:firstRowFirstColumn="0" w:firstRowLastColumn="0" w:lastRowFirstColumn="0" w:lastRowLastColumn="0"/>
-                  <w:tcW w:w="2091" w:type="dxa"/>
+                  <w:tcW w:w="1968" w:type="dxa"/>
                   <w:hideMark/>
                 </w:tcPr>
                 <w:p>
@@ -4010,7 +3940,7 @@
               </w:tc>
               <w:tc>
                 <w:tcPr>
-                  <w:tcW w:w="4401" w:type="dxa"/>
+                  <w:tcW w:w="4111" w:type="dxa"/>
                   <w:hideMark/>
                 </w:tcPr>
                 <w:p>
@@ -4037,7 +3967,7 @@
               </w:tc>
               <w:tc>
                 <w:tcPr>
-                  <w:tcW w:w="4838" w:type="dxa"/>
+                  <w:tcW w:w="4252" w:type="dxa"/>
                   <w:hideMark/>
                 </w:tcPr>
                 <w:p>
@@ -4070,7 +4000,7 @@
               <w:tc>
                 <w:tcPr>
                   <w:cnfStyle w:val="001000000000" w:firstRow="0" w:lastRow="0" w:firstColumn="1" w:lastColumn="0" w:oddVBand="0" w:evenVBand="0" w:oddHBand="0" w:evenHBand="0" w:firstRowFirstColumn="0" w:firstRowLastColumn="0" w:lastRowFirstColumn="0" w:lastRowLastColumn="0"/>
-                  <w:tcW w:w="2091" w:type="dxa"/>
+                  <w:tcW w:w="1968" w:type="dxa"/>
                   <w:hideMark/>
                 </w:tcPr>
                 <w:p>
@@ -4096,7 +4026,7 @@
               </w:tc>
               <w:tc>
                 <w:tcPr>
-                  <w:tcW w:w="4401" w:type="dxa"/>
+                  <w:tcW w:w="4111" w:type="dxa"/>
                   <w:hideMark/>
                 </w:tcPr>
                 <w:p>
@@ -4123,7 +4053,7 @@
               </w:tc>
               <w:tc>
                 <w:tcPr>
-                  <w:tcW w:w="4838" w:type="dxa"/>
+                  <w:tcW w:w="4252" w:type="dxa"/>
                   <w:hideMark/>
                 </w:tcPr>
                 <w:p>
@@ -4153,7 +4083,7 @@
               <w:tc>
                 <w:tcPr>
                   <w:cnfStyle w:val="001000000000" w:firstRow="0" w:lastRow="0" w:firstColumn="1" w:lastColumn="0" w:oddVBand="0" w:evenVBand="0" w:oddHBand="0" w:evenHBand="0" w:firstRowFirstColumn="0" w:firstRowLastColumn="0" w:lastRowFirstColumn="0" w:lastRowLastColumn="0"/>
-                  <w:tcW w:w="2091" w:type="dxa"/>
+                  <w:tcW w:w="1968" w:type="dxa"/>
                   <w:hideMark/>
                 </w:tcPr>
                 <w:p>
@@ -4179,7 +4109,7 @@
               </w:tc>
               <w:tc>
                 <w:tcPr>
-                  <w:tcW w:w="4401" w:type="dxa"/>
+                  <w:tcW w:w="4111" w:type="dxa"/>
                   <w:hideMark/>
                 </w:tcPr>
                 <w:p>
@@ -4206,7 +4136,7 @@
               </w:tc>
               <w:tc>
                 <w:tcPr>
-                  <w:tcW w:w="4838" w:type="dxa"/>
+                  <w:tcW w:w="4252" w:type="dxa"/>
                   <w:hideMark/>
                 </w:tcPr>
                 <w:p>
@@ -4239,7 +4169,7 @@
               <w:tc>
                 <w:tcPr>
                   <w:cnfStyle w:val="001000000000" w:firstRow="0" w:lastRow="0" w:firstColumn="1" w:lastColumn="0" w:oddVBand="0" w:evenVBand="0" w:oddHBand="0" w:evenHBand="0" w:firstRowFirstColumn="0" w:firstRowLastColumn="0" w:lastRowFirstColumn="0" w:lastRowLastColumn="0"/>
-                  <w:tcW w:w="2091" w:type="dxa"/>
+                  <w:tcW w:w="1968" w:type="dxa"/>
                   <w:hideMark/>
                 </w:tcPr>
                 <w:p>
@@ -4265,7 +4195,7 @@
               </w:tc>
               <w:tc>
                 <w:tcPr>
-                  <w:tcW w:w="4401" w:type="dxa"/>
+                  <w:tcW w:w="4111" w:type="dxa"/>
                   <w:hideMark/>
                 </w:tcPr>
                 <w:p>
@@ -4292,7 +4222,7 @@
               </w:tc>
               <w:tc>
                 <w:tcPr>
-                  <w:tcW w:w="4838" w:type="dxa"/>
+                  <w:tcW w:w="4252" w:type="dxa"/>
                   <w:hideMark/>
                 </w:tcPr>
                 <w:p>
@@ -4322,7 +4252,7 @@
               <w:tc>
                 <w:tcPr>
                   <w:cnfStyle w:val="001000000000" w:firstRow="0" w:lastRow="0" w:firstColumn="1" w:lastColumn="0" w:oddVBand="0" w:evenVBand="0" w:oddHBand="0" w:evenHBand="0" w:firstRowFirstColumn="0" w:firstRowLastColumn="0" w:lastRowFirstColumn="0" w:lastRowLastColumn="0"/>
-                  <w:tcW w:w="2091" w:type="dxa"/>
+                  <w:tcW w:w="1968" w:type="dxa"/>
                   <w:hideMark/>
                 </w:tcPr>
                 <w:p>
@@ -4348,7 +4278,7 @@
               </w:tc>
               <w:tc>
                 <w:tcPr>
-                  <w:tcW w:w="4401" w:type="dxa"/>
+                  <w:tcW w:w="4111" w:type="dxa"/>
                   <w:hideMark/>
                 </w:tcPr>
                 <w:p>
@@ -4375,7 +4305,7 @@
               </w:tc>
               <w:tc>
                 <w:tcPr>
-                  <w:tcW w:w="4838" w:type="dxa"/>
+                  <w:tcW w:w="4252" w:type="dxa"/>
                   <w:hideMark/>
                 </w:tcPr>
                 <w:p>
@@ -4408,7 +4338,7 @@
               <w:tc>
                 <w:tcPr>
                   <w:cnfStyle w:val="001000000000" w:firstRow="0" w:lastRow="0" w:firstColumn="1" w:lastColumn="0" w:oddVBand="0" w:evenVBand="0" w:oddHBand="0" w:evenHBand="0" w:firstRowFirstColumn="0" w:firstRowLastColumn="0" w:lastRowFirstColumn="0" w:lastRowLastColumn="0"/>
-                  <w:tcW w:w="2091" w:type="dxa"/>
+                  <w:tcW w:w="1968" w:type="dxa"/>
                   <w:hideMark/>
                 </w:tcPr>
                 <w:p>
@@ -4434,7 +4364,7 @@
               </w:tc>
               <w:tc>
                 <w:tcPr>
-                  <w:tcW w:w="4401" w:type="dxa"/>
+                  <w:tcW w:w="4111" w:type="dxa"/>
                   <w:hideMark/>
                 </w:tcPr>
                 <w:p>
@@ -4461,7 +4391,7 @@
               </w:tc>
               <w:tc>
                 <w:tcPr>
-                  <w:tcW w:w="4838" w:type="dxa"/>
+                  <w:tcW w:w="4252" w:type="dxa"/>
                   <w:hideMark/>
                 </w:tcPr>
                 <w:p>
@@ -4491,7 +4421,7 @@
               <w:tc>
                 <w:tcPr>
                   <w:cnfStyle w:val="001000000000" w:firstRow="0" w:lastRow="0" w:firstColumn="1" w:lastColumn="0" w:oddVBand="0" w:evenVBand="0" w:oddHBand="0" w:evenHBand="0" w:firstRowFirstColumn="0" w:firstRowLastColumn="0" w:lastRowFirstColumn="0" w:lastRowLastColumn="0"/>
-                  <w:tcW w:w="2091" w:type="dxa"/>
+                  <w:tcW w:w="1968" w:type="dxa"/>
                   <w:hideMark/>
                 </w:tcPr>
                 <w:p>
@@ -4517,7 +4447,7 @@
               </w:tc>
               <w:tc>
                 <w:tcPr>
-                  <w:tcW w:w="4401" w:type="dxa"/>
+                  <w:tcW w:w="4111" w:type="dxa"/>
                   <w:hideMark/>
                 </w:tcPr>
                 <w:p>
@@ -4544,7 +4474,7 @@
               </w:tc>
               <w:tc>
                 <w:tcPr>
-                  <w:tcW w:w="4838" w:type="dxa"/>
+                  <w:tcW w:w="4252" w:type="dxa"/>
                   <w:hideMark/>
                 </w:tcPr>
                 <w:p>
@@ -4577,7 +4507,7 @@
               <w:tc>
                 <w:tcPr>
                   <w:cnfStyle w:val="001000000000" w:firstRow="0" w:lastRow="0" w:firstColumn="1" w:lastColumn="0" w:oddVBand="0" w:evenVBand="0" w:oddHBand="0" w:evenHBand="0" w:firstRowFirstColumn="0" w:firstRowLastColumn="0" w:lastRowFirstColumn="0" w:lastRowLastColumn="0"/>
-                  <w:tcW w:w="2091" w:type="dxa"/>
+                  <w:tcW w:w="1968" w:type="dxa"/>
                   <w:hideMark/>
                 </w:tcPr>
                 <w:p>
@@ -4603,7 +4533,7 @@
               </w:tc>
               <w:tc>
                 <w:tcPr>
-                  <w:tcW w:w="4401" w:type="dxa"/>
+                  <w:tcW w:w="4111" w:type="dxa"/>
                   <w:hideMark/>
                 </w:tcPr>
                 <w:p>
@@ -4630,7 +4560,7 @@
               </w:tc>
               <w:tc>
                 <w:tcPr>
-                  <w:tcW w:w="4838" w:type="dxa"/>
+                  <w:tcW w:w="4252" w:type="dxa"/>
                   <w:hideMark/>
                 </w:tcPr>
                 <w:p>
@@ -4705,7 +4635,7 @@
           <w:szCs w:val="28"/>
         </w:rPr>
         <w:sectPr>
-          <w:pgSz w:w="11913" w:h="12474"/>
+          <w:pgSz w:w="11913" w:h="13892"/>
           <w:pgMar w:top="142" w:right="573" w:bottom="278" w:left="697" w:header="720" w:footer="720" w:gutter="0"/>
           <w:cols w:space="720"/>
         </w:sectPr>
@@ -5422,27 +5352,7 @@
                 <w:szCs w:val="28"/>
                 <w:lang w:val="en-IN"/>
               </w:rPr>
-              <w:t xml:space="preserve">The logit function transforms probabilities (ranging from 0 to 1) into a continuous range that spans from negative infinity to positive infinity. This transformation allows for </w:t>
-            </w:r>
-            <w:proofErr w:type="spellStart"/>
-            <w:r>
-              <w:rPr>
-                <w:rFonts w:asciiTheme="minorHAnsi" w:hAnsiTheme="minorHAnsi" w:cstheme="minorHAnsi"/>
-                <w:sz w:val="28"/>
-                <w:szCs w:val="28"/>
-                <w:lang w:val="en-IN"/>
-              </w:rPr>
-              <w:t>modeling</w:t>
-            </w:r>
-            <w:proofErr w:type="spellEnd"/>
-            <w:r>
-              <w:rPr>
-                <w:rFonts w:asciiTheme="minorHAnsi" w:hAnsiTheme="minorHAnsi" w:cstheme="minorHAnsi"/>
-                <w:sz w:val="28"/>
-                <w:szCs w:val="28"/>
-                <w:lang w:val="en-IN"/>
-              </w:rPr>
-              <w:t xml:space="preserve"> the linear relationship between the log-odds of the dependent variable and the independent variables in logistic regression.</w:t>
+              <w:t>The logit function transforms probabilities (ranging from 0 to 1) into a continuous range that spans from negative infinity to positive infinity. This transformation allows for modeling the linear relationship between the log-odds of the dependent variable and the independent variables in logistic regression.</w:t>
             </w:r>
           </w:p>
           <w:p>
@@ -5560,27 +5470,7 @@
                 <w:szCs w:val="28"/>
                 <w:lang w:val="en-IN"/>
               </w:rPr>
-              <w:t xml:space="preserve">The logit function is defined </w:t>
-            </w:r>
-            <w:proofErr w:type="spellStart"/>
-            <w:r>
-              <w:rPr>
-                <w:rFonts w:asciiTheme="minorHAnsi" w:hAnsiTheme="minorHAnsi" w:cstheme="minorHAnsi"/>
-                <w:sz w:val="28"/>
-                <w:szCs w:val="28"/>
-                <w:lang w:val="en-IN"/>
-              </w:rPr>
-              <w:t>as:l</w:t>
-            </w:r>
-            <w:proofErr w:type="spellEnd"/>
-            <w:r>
-              <w:rPr>
-                <w:rFonts w:asciiTheme="minorHAnsi" w:hAnsiTheme="minorHAnsi" w:cstheme="minorHAnsi"/>
-                <w:sz w:val="28"/>
-                <w:szCs w:val="28"/>
-                <w:lang w:val="en-IN"/>
-              </w:rPr>
-              <w:t>(x) = log(x / (1 - x))Where:</w:t>
+              <w:t>The logit function is defined as:l(x) = log(x / (1 - x))Where:</w:t>
             </w:r>
           </w:p>
           <w:p>
@@ -8707,6 +8597,7 @@
   <w:style w:type="character" w:default="1" w:styleId="DefaultParagraphFont">
     <w:name w:val="Default Paragraph Font"/>
     <w:uiPriority w:val="1"/>
+    <w:semiHidden/>
     <w:unhideWhenUsed/>
   </w:style>
   <w:style w:type="table" w:default="1" w:styleId="TableNormal">

</xml_diff>